<commit_message>
Blood bank and OT done
</commit_message>
<xml_diff>
--- a/Requirements .docx
+++ b/Requirements .docx
@@ -257,15 +257,75 @@
         <w:rPr>
           <w:b/>
         </w:rPr>
-        <w:t xml:space="preserve"> the tests Radiology performs the results will be show to the doctor there will be the dashboard for the doctors to see the patient histories and tests Radiology </w:t>
-      </w:r>
-      <w:bookmarkStart w:id="0" w:name="_GoBack"/>
-      <w:bookmarkEnd w:id="0"/>
-      <w:r>
-        <w:rPr>
-          <w:b/>
-        </w:rPr>
-        <w:t xml:space="preserve">reposts </w:t>
+        <w:t xml:space="preserve"> the tests Radiology performs the results will be show to the doctor there will be the dashboard for the doctors to see the patient histories and tests Radiology reposts </w:t>
+      </w:r>
+    </w:p>
+    <w:p>
+      <w:pPr>
+        <w:pStyle w:val="ListParagraph"/>
+        <w:numPr>
+          <w:ilvl w:val="0"/>
+          <w:numId w:val="5"/>
+        </w:numPr>
+        <w:rPr>
+          <w:b/>
+        </w:rPr>
+      </w:pPr>
+      <w:r>
+        <w:rPr>
+          <w:b/>
+        </w:rPr>
+        <w:t xml:space="preserve">There is the problem in the prescription because when we dispense the medicines the amount have added when we add the stock so need to manage this module </w:t>
+      </w:r>
+    </w:p>
+    <w:p>
+      <w:pPr>
+        <w:pStyle w:val="ListParagraph"/>
+        <w:numPr>
+          <w:ilvl w:val="0"/>
+          <w:numId w:val="5"/>
+        </w:numPr>
+        <w:rPr>
+          <w:b/>
+        </w:rPr>
+      </w:pPr>
+      <w:r>
+        <w:rPr>
+          <w:b/>
+        </w:rPr>
+        <w:t xml:space="preserve">In the radiology when find </w:t>
+      </w:r>
+      <w:proofErr w:type="spellStart"/>
+      <w:r>
+        <w:rPr>
+          <w:b/>
+        </w:rPr>
+        <w:t>some thing</w:t>
+      </w:r>
+      <w:proofErr w:type="spellEnd"/>
+      <w:r>
+        <w:rPr>
+          <w:b/>
+        </w:rPr>
+        <w:t xml:space="preserve"> critical then need to make the system like this to notify by the doctor</w:t>
+      </w:r>
+    </w:p>
+    <w:p>
+      <w:pPr>
+        <w:pStyle w:val="ListParagraph"/>
+        <w:numPr>
+          <w:ilvl w:val="0"/>
+          <w:numId w:val="5"/>
+        </w:numPr>
+        <w:rPr>
+          <w:b/>
+        </w:rPr>
+      </w:pPr>
+      <w:r>
+        <w:rPr>
+          <w:b/>
+        </w:rPr>
+        <w:t xml:space="preserve">We will make the doctor module to perform the test and to notify by radiology department to notify the doctor there will be a notification for the doctor </w:t>
       </w:r>
     </w:p>
     <w:p>
@@ -337,18 +397,1433 @@
         <w:ind w:left="1440"/>
         <w:rPr>
           <w:b/>
-        </w:rPr>
-      </w:pPr>
-    </w:p>
-    <w:p>
-      <w:pPr>
-        <w:pStyle w:val="ListParagraph"/>
-        <w:ind w:left="1440"/>
-        <w:rPr>
-          <w:b/>
-        </w:rPr>
-      </w:pPr>
-    </w:p>
+          <w:i/>
+          <w:color w:val="FF0000"/>
+          <w:sz w:val="32"/>
+          <w:szCs w:val="32"/>
+        </w:rPr>
+      </w:pPr>
+      <w:proofErr w:type="gramStart"/>
+      <w:r>
+        <w:rPr>
+          <w:b/>
+          <w:i/>
+          <w:color w:val="FF0000"/>
+          <w:sz w:val="32"/>
+          <w:szCs w:val="32"/>
+        </w:rPr>
+        <w:t>Remaining  Module</w:t>
+      </w:r>
+      <w:proofErr w:type="gramEnd"/>
+    </w:p>
+    <w:p>
+      <w:pPr>
+        <w:spacing w:before="100" w:beforeAutospacing="1" w:after="100" w:afterAutospacing="1" w:line="240" w:lineRule="auto"/>
+        <w:outlineLvl w:val="2"/>
+        <w:rPr>
+          <w:rFonts w:ascii="Times New Roman" w:eastAsia="Times New Roman" w:hAnsi="Times New Roman" w:cs="Times New Roman"/>
+          <w:b/>
+          <w:bCs/>
+          <w:sz w:val="27"/>
+          <w:szCs w:val="27"/>
+        </w:rPr>
+      </w:pPr>
+      <w:proofErr w:type="spellStart"/>
+      <w:r>
+        <w:rPr>
+          <w:rFonts w:ascii="Times New Roman" w:eastAsia="Times New Roman" w:hAnsi="Times New Roman" w:cs="Times New Roman"/>
+          <w:b/>
+          <w:bCs/>
+          <w:sz w:val="27"/>
+          <w:szCs w:val="27"/>
+        </w:rPr>
+        <w:t>Ab</w:t>
+      </w:r>
+      <w:proofErr w:type="spellEnd"/>
+      <w:r>
+        <w:rPr>
+          <w:rFonts w:ascii="Times New Roman" w:eastAsia="Times New Roman" w:hAnsi="Times New Roman" w:cs="Times New Roman"/>
+          <w:b/>
+          <w:bCs/>
+          <w:sz w:val="27"/>
+          <w:szCs w:val="27"/>
+        </w:rPr>
+        <w:t xml:space="preserve"> Remaining Modules — Priority Order</w:t>
+      </w:r>
+    </w:p>
+    <w:p>
+      <w:pPr>
+        <w:spacing w:before="100" w:beforeAutospacing="1" w:after="100" w:afterAutospacing="1" w:line="240" w:lineRule="auto"/>
+        <w:outlineLvl w:val="3"/>
+        <w:rPr>
+          <w:rFonts w:ascii="Times New Roman" w:eastAsia="Times New Roman" w:hAnsi="Times New Roman" w:cs="Times New Roman"/>
+          <w:b/>
+          <w:bCs/>
+          <w:sz w:val="24"/>
+          <w:szCs w:val="24"/>
+        </w:rPr>
+      </w:pPr>
+      <w:r>
+        <w:rPr>
+          <w:rFonts w:ascii="Segoe UI Symbol" w:eastAsia="Times New Roman" w:hAnsi="Segoe UI Symbol" w:cs="Segoe UI Symbol"/>
+          <w:b/>
+          <w:bCs/>
+          <w:sz w:val="24"/>
+          <w:szCs w:val="24"/>
+        </w:rPr>
+        <w:t>🔴</w:t>
+      </w:r>
+      <w:r>
+        <w:rPr>
+          <w:rFonts w:ascii="Times New Roman" w:eastAsia="Times New Roman" w:hAnsi="Times New Roman" w:cs="Times New Roman"/>
+          <w:b/>
+          <w:bCs/>
+          <w:sz w:val="24"/>
+          <w:szCs w:val="24"/>
+        </w:rPr>
+        <w:t xml:space="preserve"> HIGH — </w:t>
+      </w:r>
+      <w:proofErr w:type="spellStart"/>
+      <w:r>
+        <w:rPr>
+          <w:rFonts w:ascii="Times New Roman" w:eastAsia="Times New Roman" w:hAnsi="Times New Roman" w:cs="Times New Roman"/>
+          <w:b/>
+          <w:bCs/>
+          <w:sz w:val="24"/>
+          <w:szCs w:val="24"/>
+        </w:rPr>
+        <w:t>Zaroor</w:t>
+      </w:r>
+      <w:proofErr w:type="spellEnd"/>
+      <w:r>
+        <w:rPr>
+          <w:rFonts w:ascii="Times New Roman" w:eastAsia="Times New Roman" w:hAnsi="Times New Roman" w:cs="Times New Roman"/>
+          <w:b/>
+          <w:bCs/>
+          <w:sz w:val="24"/>
+          <w:szCs w:val="24"/>
+        </w:rPr>
+        <w:t xml:space="preserve"> banana </w:t>
+      </w:r>
+      <w:proofErr w:type="spellStart"/>
+      <w:r>
+        <w:rPr>
+          <w:rFonts w:ascii="Times New Roman" w:eastAsia="Times New Roman" w:hAnsi="Times New Roman" w:cs="Times New Roman"/>
+          <w:b/>
+          <w:bCs/>
+          <w:sz w:val="24"/>
+          <w:szCs w:val="24"/>
+        </w:rPr>
+        <w:t>hai</w:t>
+      </w:r>
+      <w:proofErr w:type="spellEnd"/>
+    </w:p>
+    <w:tbl>
+      <w:tblPr>
+        <w:tblW w:w="0" w:type="auto"/>
+        <w:tblCellSpacing w:w="15" w:type="dxa"/>
+        <w:tblCellMar>
+          <w:top w:w="15" w:type="dxa"/>
+          <w:left w:w="15" w:type="dxa"/>
+          <w:bottom w:w="15" w:type="dxa"/>
+          <w:right w:w="15" w:type="dxa"/>
+        </w:tblCellMar>
+        <w:tblLook w:val="04A0" w:firstRow="1" w:lastRow="0" w:firstColumn="1" w:lastColumn="0" w:noHBand="0" w:noVBand="1"/>
+      </w:tblPr>
+      <w:tblGrid>
+        <w:gridCol w:w="195"/>
+        <w:gridCol w:w="2553"/>
+        <w:gridCol w:w="5587"/>
+      </w:tblGrid>
+      <w:tr>
+        <w:trPr>
+          <w:tblHeader/>
+          <w:tblCellSpacing w:w="15" w:type="dxa"/>
+        </w:trPr>
+        <w:tc>
+          <w:tcPr>
+            <w:tcW w:w="0" w:type="auto"/>
+            <w:vAlign w:val="center"/>
+            <w:hideMark/>
+          </w:tcPr>
+          <w:p>
+            <w:pPr>
+              <w:spacing w:after="0" w:line="240" w:lineRule="auto"/>
+              <w:jc w:val="center"/>
+              <w:rPr>
+                <w:rFonts w:ascii="Times New Roman" w:eastAsia="Times New Roman" w:hAnsi="Times New Roman" w:cs="Times New Roman"/>
+                <w:b/>
+                <w:bCs/>
+                <w:sz w:val="24"/>
+                <w:szCs w:val="24"/>
+              </w:rPr>
+            </w:pPr>
+            <w:r>
+              <w:rPr>
+                <w:rFonts w:ascii="Times New Roman" w:eastAsia="Times New Roman" w:hAnsi="Times New Roman" w:cs="Times New Roman"/>
+                <w:b/>
+                <w:bCs/>
+                <w:sz w:val="24"/>
+                <w:szCs w:val="24"/>
+              </w:rPr>
+              <w:t>#</w:t>
+            </w:r>
+          </w:p>
+        </w:tc>
+        <w:tc>
+          <w:tcPr>
+            <w:tcW w:w="0" w:type="auto"/>
+            <w:vAlign w:val="center"/>
+            <w:hideMark/>
+          </w:tcPr>
+          <w:p>
+            <w:pPr>
+              <w:spacing w:after="0" w:line="240" w:lineRule="auto"/>
+              <w:jc w:val="center"/>
+              <w:rPr>
+                <w:rFonts w:ascii="Times New Roman" w:eastAsia="Times New Roman" w:hAnsi="Times New Roman" w:cs="Times New Roman"/>
+                <w:b/>
+                <w:bCs/>
+                <w:sz w:val="24"/>
+                <w:szCs w:val="24"/>
+              </w:rPr>
+            </w:pPr>
+            <w:r>
+              <w:rPr>
+                <w:rFonts w:ascii="Times New Roman" w:eastAsia="Times New Roman" w:hAnsi="Times New Roman" w:cs="Times New Roman"/>
+                <w:b/>
+                <w:bCs/>
+                <w:sz w:val="24"/>
+                <w:szCs w:val="24"/>
+              </w:rPr>
+              <w:t>Module</w:t>
+            </w:r>
+          </w:p>
+        </w:tc>
+        <w:tc>
+          <w:tcPr>
+            <w:tcW w:w="0" w:type="auto"/>
+            <w:vAlign w:val="center"/>
+            <w:hideMark/>
+          </w:tcPr>
+          <w:p>
+            <w:pPr>
+              <w:spacing w:after="0" w:line="240" w:lineRule="auto"/>
+              <w:jc w:val="center"/>
+              <w:rPr>
+                <w:rFonts w:ascii="Times New Roman" w:eastAsia="Times New Roman" w:hAnsi="Times New Roman" w:cs="Times New Roman"/>
+                <w:b/>
+                <w:bCs/>
+                <w:sz w:val="24"/>
+                <w:szCs w:val="24"/>
+              </w:rPr>
+            </w:pPr>
+            <w:proofErr w:type="spellStart"/>
+            <w:r>
+              <w:rPr>
+                <w:rFonts w:ascii="Times New Roman" w:eastAsia="Times New Roman" w:hAnsi="Times New Roman" w:cs="Times New Roman"/>
+                <w:b/>
+                <w:bCs/>
+                <w:sz w:val="24"/>
+                <w:szCs w:val="24"/>
+              </w:rPr>
+              <w:t>Kyun</w:t>
+            </w:r>
+            <w:proofErr w:type="spellEnd"/>
+            <w:r>
+              <w:rPr>
+                <w:rFonts w:ascii="Times New Roman" w:eastAsia="Times New Roman" w:hAnsi="Times New Roman" w:cs="Times New Roman"/>
+                <w:b/>
+                <w:bCs/>
+                <w:sz w:val="24"/>
+                <w:szCs w:val="24"/>
+              </w:rPr>
+              <w:t xml:space="preserve"> </w:t>
+            </w:r>
+            <w:proofErr w:type="spellStart"/>
+            <w:r>
+              <w:rPr>
+                <w:rFonts w:ascii="Times New Roman" w:eastAsia="Times New Roman" w:hAnsi="Times New Roman" w:cs="Times New Roman"/>
+                <w:b/>
+                <w:bCs/>
+                <w:sz w:val="24"/>
+                <w:szCs w:val="24"/>
+              </w:rPr>
+              <w:t>Zaroori</w:t>
+            </w:r>
+            <w:proofErr w:type="spellEnd"/>
+          </w:p>
+        </w:tc>
+      </w:tr>
+      <w:tr>
+        <w:trPr>
+          <w:tblCellSpacing w:w="15" w:type="dxa"/>
+        </w:trPr>
+        <w:tc>
+          <w:tcPr>
+            <w:tcW w:w="0" w:type="auto"/>
+            <w:vAlign w:val="center"/>
+            <w:hideMark/>
+          </w:tcPr>
+          <w:p>
+            <w:pPr>
+              <w:spacing w:after="0" w:line="240" w:lineRule="auto"/>
+              <w:rPr>
+                <w:rFonts w:ascii="Times New Roman" w:eastAsia="Times New Roman" w:hAnsi="Times New Roman" w:cs="Times New Roman"/>
+                <w:sz w:val="24"/>
+                <w:szCs w:val="24"/>
+              </w:rPr>
+            </w:pPr>
+            <w:r>
+              <w:rPr>
+                <w:rFonts w:ascii="Times New Roman" w:eastAsia="Times New Roman" w:hAnsi="Times New Roman" w:cs="Times New Roman"/>
+                <w:sz w:val="24"/>
+                <w:szCs w:val="24"/>
+              </w:rPr>
+              <w:t>1</w:t>
+            </w:r>
+          </w:p>
+        </w:tc>
+        <w:tc>
+          <w:tcPr>
+            <w:tcW w:w="0" w:type="auto"/>
+            <w:vAlign w:val="center"/>
+            <w:hideMark/>
+          </w:tcPr>
+          <w:p>
+            <w:pPr>
+              <w:spacing w:after="0" w:line="240" w:lineRule="auto"/>
+              <w:rPr>
+                <w:rFonts w:ascii="Times New Roman" w:eastAsia="Times New Roman" w:hAnsi="Times New Roman" w:cs="Times New Roman"/>
+                <w:sz w:val="24"/>
+                <w:szCs w:val="24"/>
+              </w:rPr>
+            </w:pPr>
+            <w:r>
+              <w:rPr>
+                <w:rFonts w:ascii="Times New Roman" w:eastAsia="Times New Roman" w:hAnsi="Times New Roman" w:cs="Times New Roman"/>
+                <w:b/>
+                <w:bCs/>
+                <w:sz w:val="24"/>
+                <w:szCs w:val="24"/>
+              </w:rPr>
+              <w:t>Operation Theatre (OT)</w:t>
+            </w:r>
+          </w:p>
+        </w:tc>
+        <w:tc>
+          <w:tcPr>
+            <w:tcW w:w="0" w:type="auto"/>
+            <w:vAlign w:val="center"/>
+            <w:hideMark/>
+          </w:tcPr>
+          <w:p>
+            <w:pPr>
+              <w:spacing w:after="0" w:line="240" w:lineRule="auto"/>
+              <w:rPr>
+                <w:rFonts w:ascii="Times New Roman" w:eastAsia="Times New Roman" w:hAnsi="Times New Roman" w:cs="Times New Roman"/>
+                <w:sz w:val="24"/>
+                <w:szCs w:val="24"/>
+              </w:rPr>
+            </w:pPr>
+            <w:r>
+              <w:rPr>
+                <w:rFonts w:ascii="Times New Roman" w:eastAsia="Times New Roman" w:hAnsi="Times New Roman" w:cs="Times New Roman"/>
+                <w:sz w:val="24"/>
+                <w:szCs w:val="24"/>
+              </w:rPr>
+              <w:t>Surgery scheduling, OT notes, anesthesia — core clinical</w:t>
+            </w:r>
+          </w:p>
+        </w:tc>
+      </w:tr>
+      <w:tr>
+        <w:trPr>
+          <w:tblCellSpacing w:w="15" w:type="dxa"/>
+        </w:trPr>
+        <w:tc>
+          <w:tcPr>
+            <w:tcW w:w="0" w:type="auto"/>
+            <w:vAlign w:val="center"/>
+            <w:hideMark/>
+          </w:tcPr>
+          <w:p>
+            <w:pPr>
+              <w:spacing w:after="0" w:line="240" w:lineRule="auto"/>
+              <w:rPr>
+                <w:rFonts w:ascii="Times New Roman" w:eastAsia="Times New Roman" w:hAnsi="Times New Roman" w:cs="Times New Roman"/>
+                <w:sz w:val="24"/>
+                <w:szCs w:val="24"/>
+              </w:rPr>
+            </w:pPr>
+            <w:r>
+              <w:rPr>
+                <w:rFonts w:ascii="Times New Roman" w:eastAsia="Times New Roman" w:hAnsi="Times New Roman" w:cs="Times New Roman"/>
+                <w:sz w:val="24"/>
+                <w:szCs w:val="24"/>
+              </w:rPr>
+              <w:t>2</w:t>
+            </w:r>
+          </w:p>
+        </w:tc>
+        <w:tc>
+          <w:tcPr>
+            <w:tcW w:w="0" w:type="auto"/>
+            <w:vAlign w:val="center"/>
+            <w:hideMark/>
+          </w:tcPr>
+          <w:p>
+            <w:pPr>
+              <w:spacing w:after="0" w:line="240" w:lineRule="auto"/>
+              <w:rPr>
+                <w:rFonts w:ascii="Times New Roman" w:eastAsia="Times New Roman" w:hAnsi="Times New Roman" w:cs="Times New Roman"/>
+                <w:sz w:val="24"/>
+                <w:szCs w:val="24"/>
+              </w:rPr>
+            </w:pPr>
+            <w:r>
+              <w:rPr>
+                <w:rFonts w:ascii="Times New Roman" w:eastAsia="Times New Roman" w:hAnsi="Times New Roman" w:cs="Times New Roman"/>
+                <w:b/>
+                <w:bCs/>
+                <w:sz w:val="24"/>
+                <w:szCs w:val="24"/>
+              </w:rPr>
+              <w:t>Blood Bank</w:t>
+            </w:r>
+          </w:p>
+        </w:tc>
+        <w:tc>
+          <w:tcPr>
+            <w:tcW w:w="0" w:type="auto"/>
+            <w:vAlign w:val="center"/>
+            <w:hideMark/>
+          </w:tcPr>
+          <w:p>
+            <w:pPr>
+              <w:spacing w:after="0" w:line="240" w:lineRule="auto"/>
+              <w:rPr>
+                <w:rFonts w:ascii="Times New Roman" w:eastAsia="Times New Roman" w:hAnsi="Times New Roman" w:cs="Times New Roman"/>
+                <w:sz w:val="24"/>
+                <w:szCs w:val="24"/>
+              </w:rPr>
+            </w:pPr>
+            <w:r>
+              <w:rPr>
+                <w:rFonts w:ascii="Times New Roman" w:eastAsia="Times New Roman" w:hAnsi="Times New Roman" w:cs="Times New Roman"/>
+                <w:sz w:val="24"/>
+                <w:szCs w:val="24"/>
+              </w:rPr>
+              <w:t xml:space="preserve">Patient surgery/emergency </w:t>
+            </w:r>
+            <w:proofErr w:type="spellStart"/>
+            <w:r>
+              <w:rPr>
+                <w:rFonts w:ascii="Times New Roman" w:eastAsia="Times New Roman" w:hAnsi="Times New Roman" w:cs="Times New Roman"/>
+                <w:sz w:val="24"/>
+                <w:szCs w:val="24"/>
+              </w:rPr>
+              <w:t>ke</w:t>
+            </w:r>
+            <w:proofErr w:type="spellEnd"/>
+            <w:r>
+              <w:rPr>
+                <w:rFonts w:ascii="Times New Roman" w:eastAsia="Times New Roman" w:hAnsi="Times New Roman" w:cs="Times New Roman"/>
+                <w:sz w:val="24"/>
+                <w:szCs w:val="24"/>
+              </w:rPr>
+              <w:t xml:space="preserve"> </w:t>
+            </w:r>
+            <w:proofErr w:type="spellStart"/>
+            <w:r>
+              <w:rPr>
+                <w:rFonts w:ascii="Times New Roman" w:eastAsia="Times New Roman" w:hAnsi="Times New Roman" w:cs="Times New Roman"/>
+                <w:sz w:val="24"/>
+                <w:szCs w:val="24"/>
+              </w:rPr>
+              <w:t>liye</w:t>
+            </w:r>
+            <w:proofErr w:type="spellEnd"/>
+            <w:r>
+              <w:rPr>
+                <w:rFonts w:ascii="Times New Roman" w:eastAsia="Times New Roman" w:hAnsi="Times New Roman" w:cs="Times New Roman"/>
+                <w:sz w:val="24"/>
+                <w:szCs w:val="24"/>
+              </w:rPr>
+              <w:t xml:space="preserve"> must-have</w:t>
+            </w:r>
+          </w:p>
+        </w:tc>
+      </w:tr>
+      <w:tr>
+        <w:trPr>
+          <w:tblCellSpacing w:w="15" w:type="dxa"/>
+        </w:trPr>
+        <w:tc>
+          <w:tcPr>
+            <w:tcW w:w="0" w:type="auto"/>
+            <w:vAlign w:val="center"/>
+            <w:hideMark/>
+          </w:tcPr>
+          <w:p>
+            <w:pPr>
+              <w:spacing w:after="0" w:line="240" w:lineRule="auto"/>
+              <w:rPr>
+                <w:rFonts w:ascii="Times New Roman" w:eastAsia="Times New Roman" w:hAnsi="Times New Roman" w:cs="Times New Roman"/>
+                <w:sz w:val="24"/>
+                <w:szCs w:val="24"/>
+              </w:rPr>
+            </w:pPr>
+            <w:r>
+              <w:rPr>
+                <w:rFonts w:ascii="Times New Roman" w:eastAsia="Times New Roman" w:hAnsi="Times New Roman" w:cs="Times New Roman"/>
+                <w:sz w:val="24"/>
+                <w:szCs w:val="24"/>
+              </w:rPr>
+              <w:t>3</w:t>
+            </w:r>
+          </w:p>
+        </w:tc>
+        <w:tc>
+          <w:tcPr>
+            <w:tcW w:w="0" w:type="auto"/>
+            <w:vAlign w:val="center"/>
+            <w:hideMark/>
+          </w:tcPr>
+          <w:p>
+            <w:pPr>
+              <w:spacing w:after="0" w:line="240" w:lineRule="auto"/>
+              <w:rPr>
+                <w:rFonts w:ascii="Times New Roman" w:eastAsia="Times New Roman" w:hAnsi="Times New Roman" w:cs="Times New Roman"/>
+                <w:sz w:val="24"/>
+                <w:szCs w:val="24"/>
+              </w:rPr>
+            </w:pPr>
+            <w:r>
+              <w:rPr>
+                <w:rFonts w:ascii="Times New Roman" w:eastAsia="Times New Roman" w:hAnsi="Times New Roman" w:cs="Times New Roman"/>
+                <w:b/>
+                <w:bCs/>
+                <w:sz w:val="24"/>
+                <w:szCs w:val="24"/>
+              </w:rPr>
+              <w:t>Insurance Management</w:t>
+            </w:r>
+          </w:p>
+        </w:tc>
+        <w:tc>
+          <w:tcPr>
+            <w:tcW w:w="0" w:type="auto"/>
+            <w:vAlign w:val="center"/>
+            <w:hideMark/>
+          </w:tcPr>
+          <w:p>
+            <w:pPr>
+              <w:spacing w:after="0" w:line="240" w:lineRule="auto"/>
+              <w:rPr>
+                <w:rFonts w:ascii="Times New Roman" w:eastAsia="Times New Roman" w:hAnsi="Times New Roman" w:cs="Times New Roman"/>
+                <w:sz w:val="24"/>
+                <w:szCs w:val="24"/>
+              </w:rPr>
+            </w:pPr>
+            <w:r>
+              <w:rPr>
+                <w:rFonts w:ascii="Times New Roman" w:eastAsia="Times New Roman" w:hAnsi="Times New Roman" w:cs="Times New Roman"/>
+                <w:sz w:val="24"/>
+                <w:szCs w:val="24"/>
+              </w:rPr>
+              <w:t xml:space="preserve">Patients </w:t>
+            </w:r>
+            <w:proofErr w:type="spellStart"/>
+            <w:r>
+              <w:rPr>
+                <w:rFonts w:ascii="Times New Roman" w:eastAsia="Times New Roman" w:hAnsi="Times New Roman" w:cs="Times New Roman"/>
+                <w:sz w:val="24"/>
+                <w:szCs w:val="24"/>
+              </w:rPr>
+              <w:t>ka</w:t>
+            </w:r>
+            <w:proofErr w:type="spellEnd"/>
+            <w:r>
+              <w:rPr>
+                <w:rFonts w:ascii="Times New Roman" w:eastAsia="Times New Roman" w:hAnsi="Times New Roman" w:cs="Times New Roman"/>
+                <w:sz w:val="24"/>
+                <w:szCs w:val="24"/>
+              </w:rPr>
+              <w:t xml:space="preserve"> insurance, claims — billing se </w:t>
+            </w:r>
+            <w:proofErr w:type="spellStart"/>
+            <w:r>
+              <w:rPr>
+                <w:rFonts w:ascii="Times New Roman" w:eastAsia="Times New Roman" w:hAnsi="Times New Roman" w:cs="Times New Roman"/>
+                <w:sz w:val="24"/>
+                <w:szCs w:val="24"/>
+              </w:rPr>
+              <w:t>pehle</w:t>
+            </w:r>
+            <w:proofErr w:type="spellEnd"/>
+            <w:r>
+              <w:rPr>
+                <w:rFonts w:ascii="Times New Roman" w:eastAsia="Times New Roman" w:hAnsi="Times New Roman" w:cs="Times New Roman"/>
+                <w:sz w:val="24"/>
+                <w:szCs w:val="24"/>
+              </w:rPr>
+              <w:t xml:space="preserve"> </w:t>
+            </w:r>
+            <w:proofErr w:type="spellStart"/>
+            <w:r>
+              <w:rPr>
+                <w:rFonts w:ascii="Times New Roman" w:eastAsia="Times New Roman" w:hAnsi="Times New Roman" w:cs="Times New Roman"/>
+                <w:sz w:val="24"/>
+                <w:szCs w:val="24"/>
+              </w:rPr>
+              <w:t>chahiye</w:t>
+            </w:r>
+            <w:proofErr w:type="spellEnd"/>
+          </w:p>
+        </w:tc>
+      </w:tr>
+    </w:tbl>
+    <w:p>
+      <w:pPr>
+        <w:spacing w:before="100" w:beforeAutospacing="1" w:after="100" w:afterAutospacing="1" w:line="240" w:lineRule="auto"/>
+        <w:outlineLvl w:val="3"/>
+        <w:rPr>
+          <w:rFonts w:ascii="Times New Roman" w:eastAsia="Times New Roman" w:hAnsi="Times New Roman" w:cs="Times New Roman"/>
+          <w:b/>
+          <w:bCs/>
+          <w:sz w:val="24"/>
+          <w:szCs w:val="24"/>
+        </w:rPr>
+      </w:pPr>
+      <w:r>
+        <w:rPr>
+          <w:rFonts w:ascii="Times New Roman" w:eastAsia="Times New Roman" w:hAnsi="Times New Roman" w:cs="Times New Roman"/>
+          <w:b/>
+          <w:bCs/>
+          <w:sz w:val="24"/>
+          <w:szCs w:val="24"/>
+        </w:rPr>
+        <w:t xml:space="preserve">🟡 MEDIUM — Banana </w:t>
+      </w:r>
+      <w:proofErr w:type="spellStart"/>
+      <w:r>
+        <w:rPr>
+          <w:rFonts w:ascii="Times New Roman" w:eastAsia="Times New Roman" w:hAnsi="Times New Roman" w:cs="Times New Roman"/>
+          <w:b/>
+          <w:bCs/>
+          <w:sz w:val="24"/>
+          <w:szCs w:val="24"/>
+        </w:rPr>
+        <w:t>chahiye</w:t>
+      </w:r>
+      <w:proofErr w:type="spellEnd"/>
+    </w:p>
+    <w:tbl>
+      <w:tblPr>
+        <w:tblW w:w="0" w:type="auto"/>
+        <w:tblCellSpacing w:w="15" w:type="dxa"/>
+        <w:tblCellMar>
+          <w:top w:w="15" w:type="dxa"/>
+          <w:left w:w="15" w:type="dxa"/>
+          <w:bottom w:w="15" w:type="dxa"/>
+          <w:right w:w="15" w:type="dxa"/>
+        </w:tblCellMar>
+        <w:tblLook w:val="04A0" w:firstRow="1" w:lastRow="0" w:firstColumn="1" w:lastColumn="0" w:noHBand="0" w:noVBand="1"/>
+      </w:tblPr>
+      <w:tblGrid>
+        <w:gridCol w:w="195"/>
+        <w:gridCol w:w="2333"/>
+        <w:gridCol w:w="5267"/>
+      </w:tblGrid>
+      <w:tr>
+        <w:trPr>
+          <w:tblHeader/>
+          <w:tblCellSpacing w:w="15" w:type="dxa"/>
+        </w:trPr>
+        <w:tc>
+          <w:tcPr>
+            <w:tcW w:w="0" w:type="auto"/>
+            <w:vAlign w:val="center"/>
+            <w:hideMark/>
+          </w:tcPr>
+          <w:p>
+            <w:pPr>
+              <w:spacing w:after="0" w:line="240" w:lineRule="auto"/>
+              <w:jc w:val="center"/>
+              <w:rPr>
+                <w:rFonts w:ascii="Times New Roman" w:eastAsia="Times New Roman" w:hAnsi="Times New Roman" w:cs="Times New Roman"/>
+                <w:b/>
+                <w:bCs/>
+                <w:sz w:val="24"/>
+                <w:szCs w:val="24"/>
+              </w:rPr>
+            </w:pPr>
+            <w:r>
+              <w:rPr>
+                <w:rFonts w:ascii="Times New Roman" w:eastAsia="Times New Roman" w:hAnsi="Times New Roman" w:cs="Times New Roman"/>
+                <w:b/>
+                <w:bCs/>
+                <w:sz w:val="24"/>
+                <w:szCs w:val="24"/>
+              </w:rPr>
+              <w:t>#</w:t>
+            </w:r>
+          </w:p>
+        </w:tc>
+        <w:tc>
+          <w:tcPr>
+            <w:tcW w:w="0" w:type="auto"/>
+            <w:vAlign w:val="center"/>
+            <w:hideMark/>
+          </w:tcPr>
+          <w:p>
+            <w:pPr>
+              <w:spacing w:after="0" w:line="240" w:lineRule="auto"/>
+              <w:jc w:val="center"/>
+              <w:rPr>
+                <w:rFonts w:ascii="Times New Roman" w:eastAsia="Times New Roman" w:hAnsi="Times New Roman" w:cs="Times New Roman"/>
+                <w:b/>
+                <w:bCs/>
+                <w:sz w:val="24"/>
+                <w:szCs w:val="24"/>
+              </w:rPr>
+            </w:pPr>
+            <w:r>
+              <w:rPr>
+                <w:rFonts w:ascii="Times New Roman" w:eastAsia="Times New Roman" w:hAnsi="Times New Roman" w:cs="Times New Roman"/>
+                <w:b/>
+                <w:bCs/>
+                <w:sz w:val="24"/>
+                <w:szCs w:val="24"/>
+              </w:rPr>
+              <w:t>Module</w:t>
+            </w:r>
+          </w:p>
+        </w:tc>
+        <w:tc>
+          <w:tcPr>
+            <w:tcW w:w="0" w:type="auto"/>
+            <w:vAlign w:val="center"/>
+            <w:hideMark/>
+          </w:tcPr>
+          <w:p>
+            <w:pPr>
+              <w:spacing w:after="0" w:line="240" w:lineRule="auto"/>
+              <w:jc w:val="center"/>
+              <w:rPr>
+                <w:rFonts w:ascii="Times New Roman" w:eastAsia="Times New Roman" w:hAnsi="Times New Roman" w:cs="Times New Roman"/>
+                <w:b/>
+                <w:bCs/>
+                <w:sz w:val="24"/>
+                <w:szCs w:val="24"/>
+              </w:rPr>
+            </w:pPr>
+            <w:proofErr w:type="spellStart"/>
+            <w:r>
+              <w:rPr>
+                <w:rFonts w:ascii="Times New Roman" w:eastAsia="Times New Roman" w:hAnsi="Times New Roman" w:cs="Times New Roman"/>
+                <w:b/>
+                <w:bCs/>
+                <w:sz w:val="24"/>
+                <w:szCs w:val="24"/>
+              </w:rPr>
+              <w:t>Kyun</w:t>
+            </w:r>
+            <w:proofErr w:type="spellEnd"/>
+          </w:p>
+        </w:tc>
+      </w:tr>
+      <w:tr>
+        <w:trPr>
+          <w:tblCellSpacing w:w="15" w:type="dxa"/>
+        </w:trPr>
+        <w:tc>
+          <w:tcPr>
+            <w:tcW w:w="0" w:type="auto"/>
+            <w:vAlign w:val="center"/>
+            <w:hideMark/>
+          </w:tcPr>
+          <w:p>
+            <w:pPr>
+              <w:spacing w:after="0" w:line="240" w:lineRule="auto"/>
+              <w:rPr>
+                <w:rFonts w:ascii="Times New Roman" w:eastAsia="Times New Roman" w:hAnsi="Times New Roman" w:cs="Times New Roman"/>
+                <w:sz w:val="24"/>
+                <w:szCs w:val="24"/>
+              </w:rPr>
+            </w:pPr>
+            <w:r>
+              <w:rPr>
+                <w:rFonts w:ascii="Times New Roman" w:eastAsia="Times New Roman" w:hAnsi="Times New Roman" w:cs="Times New Roman"/>
+                <w:sz w:val="24"/>
+                <w:szCs w:val="24"/>
+              </w:rPr>
+              <w:t>4</w:t>
+            </w:r>
+          </w:p>
+        </w:tc>
+        <w:tc>
+          <w:tcPr>
+            <w:tcW w:w="0" w:type="auto"/>
+            <w:vAlign w:val="center"/>
+            <w:hideMark/>
+          </w:tcPr>
+          <w:p>
+            <w:pPr>
+              <w:spacing w:after="0" w:line="240" w:lineRule="auto"/>
+              <w:rPr>
+                <w:rFonts w:ascii="Times New Roman" w:eastAsia="Times New Roman" w:hAnsi="Times New Roman" w:cs="Times New Roman"/>
+                <w:sz w:val="24"/>
+                <w:szCs w:val="24"/>
+              </w:rPr>
+            </w:pPr>
+            <w:r>
+              <w:rPr>
+                <w:rFonts w:ascii="Times New Roman" w:eastAsia="Times New Roman" w:hAnsi="Times New Roman" w:cs="Times New Roman"/>
+                <w:b/>
+                <w:bCs/>
+                <w:sz w:val="24"/>
+                <w:szCs w:val="24"/>
+              </w:rPr>
+              <w:t>Physiotherapy</w:t>
+            </w:r>
+            <w:r>
+              <w:rPr>
+                <w:rFonts w:ascii="Times New Roman" w:eastAsia="Times New Roman" w:hAnsi="Times New Roman" w:cs="Times New Roman"/>
+                <w:b/>
+                <w:bCs/>
+                <w:sz w:val="24"/>
+                <w:szCs w:val="24"/>
+              </w:rPr>
+              <w:t xml:space="preserve">                 </w:t>
+            </w:r>
+            <w:bookmarkStart w:id="0" w:name="_GoBack"/>
+            <w:bookmarkEnd w:id="0"/>
+          </w:p>
+        </w:tc>
+        <w:tc>
+          <w:tcPr>
+            <w:tcW w:w="0" w:type="auto"/>
+            <w:vAlign w:val="center"/>
+            <w:hideMark/>
+          </w:tcPr>
+          <w:p>
+            <w:pPr>
+              <w:spacing w:after="0" w:line="240" w:lineRule="auto"/>
+              <w:rPr>
+                <w:rFonts w:ascii="Times New Roman" w:eastAsia="Times New Roman" w:hAnsi="Times New Roman" w:cs="Times New Roman"/>
+                <w:sz w:val="24"/>
+                <w:szCs w:val="24"/>
+              </w:rPr>
+            </w:pPr>
+            <w:r>
+              <w:rPr>
+                <w:rFonts w:ascii="Times New Roman" w:eastAsia="Times New Roman" w:hAnsi="Times New Roman" w:cs="Times New Roman"/>
+                <w:sz w:val="24"/>
+                <w:szCs w:val="24"/>
+              </w:rPr>
+              <w:t xml:space="preserve">OT </w:t>
+            </w:r>
+            <w:proofErr w:type="spellStart"/>
+            <w:r>
+              <w:rPr>
+                <w:rFonts w:ascii="Times New Roman" w:eastAsia="Times New Roman" w:hAnsi="Times New Roman" w:cs="Times New Roman"/>
+                <w:sz w:val="24"/>
+                <w:szCs w:val="24"/>
+              </w:rPr>
+              <w:t>ke</w:t>
+            </w:r>
+            <w:proofErr w:type="spellEnd"/>
+            <w:r>
+              <w:rPr>
+                <w:rFonts w:ascii="Times New Roman" w:eastAsia="Times New Roman" w:hAnsi="Times New Roman" w:cs="Times New Roman"/>
+                <w:sz w:val="24"/>
+                <w:szCs w:val="24"/>
+              </w:rPr>
+              <w:t xml:space="preserve"> </w:t>
+            </w:r>
+            <w:proofErr w:type="spellStart"/>
+            <w:r>
+              <w:rPr>
+                <w:rFonts w:ascii="Times New Roman" w:eastAsia="Times New Roman" w:hAnsi="Times New Roman" w:cs="Times New Roman"/>
+                <w:sz w:val="24"/>
+                <w:szCs w:val="24"/>
+              </w:rPr>
+              <w:t>baad</w:t>
+            </w:r>
+            <w:proofErr w:type="spellEnd"/>
+            <w:r>
+              <w:rPr>
+                <w:rFonts w:ascii="Times New Roman" w:eastAsia="Times New Roman" w:hAnsi="Times New Roman" w:cs="Times New Roman"/>
+                <w:sz w:val="24"/>
+                <w:szCs w:val="24"/>
+              </w:rPr>
+              <w:t xml:space="preserve"> recovery — common department</w:t>
+            </w:r>
+          </w:p>
+        </w:tc>
+      </w:tr>
+      <w:tr>
+        <w:trPr>
+          <w:tblCellSpacing w:w="15" w:type="dxa"/>
+        </w:trPr>
+        <w:tc>
+          <w:tcPr>
+            <w:tcW w:w="0" w:type="auto"/>
+            <w:vAlign w:val="center"/>
+            <w:hideMark/>
+          </w:tcPr>
+          <w:p>
+            <w:pPr>
+              <w:spacing w:after="0" w:line="240" w:lineRule="auto"/>
+              <w:rPr>
+                <w:rFonts w:ascii="Times New Roman" w:eastAsia="Times New Roman" w:hAnsi="Times New Roman" w:cs="Times New Roman"/>
+                <w:sz w:val="24"/>
+                <w:szCs w:val="24"/>
+              </w:rPr>
+            </w:pPr>
+            <w:r>
+              <w:rPr>
+                <w:rFonts w:ascii="Times New Roman" w:eastAsia="Times New Roman" w:hAnsi="Times New Roman" w:cs="Times New Roman"/>
+                <w:sz w:val="24"/>
+                <w:szCs w:val="24"/>
+              </w:rPr>
+              <w:t>5</w:t>
+            </w:r>
+          </w:p>
+        </w:tc>
+        <w:tc>
+          <w:tcPr>
+            <w:tcW w:w="0" w:type="auto"/>
+            <w:vAlign w:val="center"/>
+            <w:hideMark/>
+          </w:tcPr>
+          <w:p>
+            <w:pPr>
+              <w:spacing w:after="0" w:line="240" w:lineRule="auto"/>
+              <w:rPr>
+                <w:rFonts w:ascii="Times New Roman" w:eastAsia="Times New Roman" w:hAnsi="Times New Roman" w:cs="Times New Roman"/>
+                <w:sz w:val="24"/>
+                <w:szCs w:val="24"/>
+              </w:rPr>
+            </w:pPr>
+            <w:r>
+              <w:rPr>
+                <w:rFonts w:ascii="Times New Roman" w:eastAsia="Times New Roman" w:hAnsi="Times New Roman" w:cs="Times New Roman"/>
+                <w:b/>
+                <w:bCs/>
+                <w:sz w:val="24"/>
+                <w:szCs w:val="24"/>
+              </w:rPr>
+              <w:t>Diet &amp; Nutrition</w:t>
+            </w:r>
+          </w:p>
+        </w:tc>
+        <w:tc>
+          <w:tcPr>
+            <w:tcW w:w="0" w:type="auto"/>
+            <w:vAlign w:val="center"/>
+            <w:hideMark/>
+          </w:tcPr>
+          <w:p>
+            <w:pPr>
+              <w:spacing w:after="0" w:line="240" w:lineRule="auto"/>
+              <w:rPr>
+                <w:rFonts w:ascii="Times New Roman" w:eastAsia="Times New Roman" w:hAnsi="Times New Roman" w:cs="Times New Roman"/>
+                <w:sz w:val="24"/>
+                <w:szCs w:val="24"/>
+              </w:rPr>
+            </w:pPr>
+            <w:r>
+              <w:rPr>
+                <w:rFonts w:ascii="Times New Roman" w:eastAsia="Times New Roman" w:hAnsi="Times New Roman" w:cs="Times New Roman"/>
+                <w:sz w:val="24"/>
+                <w:szCs w:val="24"/>
+              </w:rPr>
+              <w:t xml:space="preserve">IPD patients </w:t>
+            </w:r>
+            <w:proofErr w:type="spellStart"/>
+            <w:r>
+              <w:rPr>
+                <w:rFonts w:ascii="Times New Roman" w:eastAsia="Times New Roman" w:hAnsi="Times New Roman" w:cs="Times New Roman"/>
+                <w:sz w:val="24"/>
+                <w:szCs w:val="24"/>
+              </w:rPr>
+              <w:t>ke</w:t>
+            </w:r>
+            <w:proofErr w:type="spellEnd"/>
+            <w:r>
+              <w:rPr>
+                <w:rFonts w:ascii="Times New Roman" w:eastAsia="Times New Roman" w:hAnsi="Times New Roman" w:cs="Times New Roman"/>
+                <w:sz w:val="24"/>
+                <w:szCs w:val="24"/>
+              </w:rPr>
+              <w:t xml:space="preserve"> </w:t>
+            </w:r>
+            <w:proofErr w:type="spellStart"/>
+            <w:r>
+              <w:rPr>
+                <w:rFonts w:ascii="Times New Roman" w:eastAsia="Times New Roman" w:hAnsi="Times New Roman" w:cs="Times New Roman"/>
+                <w:sz w:val="24"/>
+                <w:szCs w:val="24"/>
+              </w:rPr>
+              <w:t>liye</w:t>
+            </w:r>
+            <w:proofErr w:type="spellEnd"/>
+            <w:r>
+              <w:rPr>
+                <w:rFonts w:ascii="Times New Roman" w:eastAsia="Times New Roman" w:hAnsi="Times New Roman" w:cs="Times New Roman"/>
+                <w:sz w:val="24"/>
+                <w:szCs w:val="24"/>
+              </w:rPr>
+              <w:t xml:space="preserve"> diet plans</w:t>
+            </w:r>
+          </w:p>
+        </w:tc>
+      </w:tr>
+      <w:tr>
+        <w:trPr>
+          <w:tblCellSpacing w:w="15" w:type="dxa"/>
+        </w:trPr>
+        <w:tc>
+          <w:tcPr>
+            <w:tcW w:w="0" w:type="auto"/>
+            <w:vAlign w:val="center"/>
+            <w:hideMark/>
+          </w:tcPr>
+          <w:p>
+            <w:pPr>
+              <w:spacing w:after="0" w:line="240" w:lineRule="auto"/>
+              <w:rPr>
+                <w:rFonts w:ascii="Times New Roman" w:eastAsia="Times New Roman" w:hAnsi="Times New Roman" w:cs="Times New Roman"/>
+                <w:sz w:val="24"/>
+                <w:szCs w:val="24"/>
+              </w:rPr>
+            </w:pPr>
+            <w:r>
+              <w:rPr>
+                <w:rFonts w:ascii="Times New Roman" w:eastAsia="Times New Roman" w:hAnsi="Times New Roman" w:cs="Times New Roman"/>
+                <w:sz w:val="24"/>
+                <w:szCs w:val="24"/>
+              </w:rPr>
+              <w:t>6</w:t>
+            </w:r>
+          </w:p>
+        </w:tc>
+        <w:tc>
+          <w:tcPr>
+            <w:tcW w:w="0" w:type="auto"/>
+            <w:vAlign w:val="center"/>
+            <w:hideMark/>
+          </w:tcPr>
+          <w:p>
+            <w:pPr>
+              <w:spacing w:after="0" w:line="240" w:lineRule="auto"/>
+              <w:rPr>
+                <w:rFonts w:ascii="Times New Roman" w:eastAsia="Times New Roman" w:hAnsi="Times New Roman" w:cs="Times New Roman"/>
+                <w:sz w:val="24"/>
+                <w:szCs w:val="24"/>
+              </w:rPr>
+            </w:pPr>
+            <w:r>
+              <w:rPr>
+                <w:rFonts w:ascii="Times New Roman" w:eastAsia="Times New Roman" w:hAnsi="Times New Roman" w:cs="Times New Roman"/>
+                <w:b/>
+                <w:bCs/>
+                <w:sz w:val="24"/>
+                <w:szCs w:val="24"/>
+              </w:rPr>
+              <w:t>Referral Management</w:t>
+            </w:r>
+          </w:p>
+        </w:tc>
+        <w:tc>
+          <w:tcPr>
+            <w:tcW w:w="0" w:type="auto"/>
+            <w:vAlign w:val="center"/>
+            <w:hideMark/>
+          </w:tcPr>
+          <w:p>
+            <w:pPr>
+              <w:spacing w:after="0" w:line="240" w:lineRule="auto"/>
+              <w:rPr>
+                <w:rFonts w:ascii="Times New Roman" w:eastAsia="Times New Roman" w:hAnsi="Times New Roman" w:cs="Times New Roman"/>
+                <w:sz w:val="24"/>
+                <w:szCs w:val="24"/>
+              </w:rPr>
+            </w:pPr>
+            <w:r>
+              <w:rPr>
+                <w:rFonts w:ascii="Times New Roman" w:eastAsia="Times New Roman" w:hAnsi="Times New Roman" w:cs="Times New Roman"/>
+                <w:sz w:val="24"/>
+                <w:szCs w:val="24"/>
+              </w:rPr>
+              <w:t>Doctor-to-doctor, internal/external referrals</w:t>
+            </w:r>
+          </w:p>
+        </w:tc>
+      </w:tr>
+      <w:tr>
+        <w:trPr>
+          <w:tblCellSpacing w:w="15" w:type="dxa"/>
+        </w:trPr>
+        <w:tc>
+          <w:tcPr>
+            <w:tcW w:w="0" w:type="auto"/>
+            <w:vAlign w:val="center"/>
+            <w:hideMark/>
+          </w:tcPr>
+          <w:p>
+            <w:pPr>
+              <w:spacing w:after="0" w:line="240" w:lineRule="auto"/>
+              <w:rPr>
+                <w:rFonts w:ascii="Times New Roman" w:eastAsia="Times New Roman" w:hAnsi="Times New Roman" w:cs="Times New Roman"/>
+                <w:sz w:val="24"/>
+                <w:szCs w:val="24"/>
+              </w:rPr>
+            </w:pPr>
+            <w:r>
+              <w:rPr>
+                <w:rFonts w:ascii="Times New Roman" w:eastAsia="Times New Roman" w:hAnsi="Times New Roman" w:cs="Times New Roman"/>
+                <w:sz w:val="24"/>
+                <w:szCs w:val="24"/>
+              </w:rPr>
+              <w:t>7</w:t>
+            </w:r>
+          </w:p>
+        </w:tc>
+        <w:tc>
+          <w:tcPr>
+            <w:tcW w:w="0" w:type="auto"/>
+            <w:vAlign w:val="center"/>
+            <w:hideMark/>
+          </w:tcPr>
+          <w:p>
+            <w:pPr>
+              <w:spacing w:after="0" w:line="240" w:lineRule="auto"/>
+              <w:rPr>
+                <w:rFonts w:ascii="Times New Roman" w:eastAsia="Times New Roman" w:hAnsi="Times New Roman" w:cs="Times New Roman"/>
+                <w:sz w:val="24"/>
+                <w:szCs w:val="24"/>
+              </w:rPr>
+            </w:pPr>
+            <w:r>
+              <w:rPr>
+                <w:rFonts w:ascii="Times New Roman" w:eastAsia="Times New Roman" w:hAnsi="Times New Roman" w:cs="Times New Roman"/>
+                <w:b/>
+                <w:bCs/>
+                <w:sz w:val="24"/>
+                <w:szCs w:val="24"/>
+              </w:rPr>
+              <w:t>Mortuary</w:t>
+            </w:r>
+          </w:p>
+        </w:tc>
+        <w:tc>
+          <w:tcPr>
+            <w:tcW w:w="0" w:type="auto"/>
+            <w:vAlign w:val="center"/>
+            <w:hideMark/>
+          </w:tcPr>
+          <w:p>
+            <w:pPr>
+              <w:spacing w:after="0" w:line="240" w:lineRule="auto"/>
+              <w:rPr>
+                <w:rFonts w:ascii="Times New Roman" w:eastAsia="Times New Roman" w:hAnsi="Times New Roman" w:cs="Times New Roman"/>
+                <w:sz w:val="24"/>
+                <w:szCs w:val="24"/>
+              </w:rPr>
+            </w:pPr>
+            <w:r>
+              <w:rPr>
+                <w:rFonts w:ascii="Times New Roman" w:eastAsia="Times New Roman" w:hAnsi="Times New Roman" w:cs="Times New Roman"/>
+                <w:sz w:val="24"/>
+                <w:szCs w:val="24"/>
+              </w:rPr>
+              <w:t>Death certificate, body handover — legal requirement</w:t>
+            </w:r>
+          </w:p>
+        </w:tc>
+      </w:tr>
+    </w:tbl>
+    <w:p>
+      <w:pPr>
+        <w:spacing w:before="100" w:beforeAutospacing="1" w:after="100" w:afterAutospacing="1" w:line="240" w:lineRule="auto"/>
+        <w:outlineLvl w:val="3"/>
+        <w:rPr>
+          <w:rFonts w:ascii="Times New Roman" w:eastAsia="Times New Roman" w:hAnsi="Times New Roman" w:cs="Times New Roman"/>
+          <w:b/>
+          <w:bCs/>
+          <w:sz w:val="24"/>
+          <w:szCs w:val="24"/>
+        </w:rPr>
+      </w:pPr>
+      <w:r>
+        <w:rPr>
+          <w:rFonts w:ascii="Times New Roman" w:eastAsia="Times New Roman" w:hAnsi="Times New Roman" w:cs="Times New Roman"/>
+          <w:b/>
+          <w:bCs/>
+          <w:sz w:val="24"/>
+          <w:szCs w:val="24"/>
+        </w:rPr>
+        <w:t>🟢 LOW — Optional</w:t>
+      </w:r>
+    </w:p>
+    <w:tbl>
+      <w:tblPr>
+        <w:tblW w:w="0" w:type="auto"/>
+        <w:tblCellSpacing w:w="15" w:type="dxa"/>
+        <w:tblCellMar>
+          <w:top w:w="15" w:type="dxa"/>
+          <w:left w:w="15" w:type="dxa"/>
+          <w:bottom w:w="15" w:type="dxa"/>
+          <w:right w:w="15" w:type="dxa"/>
+        </w:tblCellMar>
+        <w:tblLook w:val="04A0" w:firstRow="1" w:lastRow="0" w:firstColumn="1" w:lastColumn="0" w:noHBand="0" w:noVBand="1"/>
+      </w:tblPr>
+      <w:tblGrid>
+        <w:gridCol w:w="315"/>
+        <w:gridCol w:w="2655"/>
+      </w:tblGrid>
+      <w:tr>
+        <w:trPr>
+          <w:tblHeader/>
+          <w:tblCellSpacing w:w="15" w:type="dxa"/>
+        </w:trPr>
+        <w:tc>
+          <w:tcPr>
+            <w:tcW w:w="0" w:type="auto"/>
+            <w:vAlign w:val="center"/>
+            <w:hideMark/>
+          </w:tcPr>
+          <w:p>
+            <w:pPr>
+              <w:spacing w:after="0" w:line="240" w:lineRule="auto"/>
+              <w:jc w:val="center"/>
+              <w:rPr>
+                <w:rFonts w:ascii="Times New Roman" w:eastAsia="Times New Roman" w:hAnsi="Times New Roman" w:cs="Times New Roman"/>
+                <w:b/>
+                <w:bCs/>
+                <w:sz w:val="24"/>
+                <w:szCs w:val="24"/>
+              </w:rPr>
+            </w:pPr>
+            <w:r>
+              <w:rPr>
+                <w:rFonts w:ascii="Times New Roman" w:eastAsia="Times New Roman" w:hAnsi="Times New Roman" w:cs="Times New Roman"/>
+                <w:b/>
+                <w:bCs/>
+                <w:sz w:val="24"/>
+                <w:szCs w:val="24"/>
+              </w:rPr>
+              <w:t>#</w:t>
+            </w:r>
+          </w:p>
+        </w:tc>
+        <w:tc>
+          <w:tcPr>
+            <w:tcW w:w="0" w:type="auto"/>
+            <w:vAlign w:val="center"/>
+            <w:hideMark/>
+          </w:tcPr>
+          <w:p>
+            <w:pPr>
+              <w:spacing w:after="0" w:line="240" w:lineRule="auto"/>
+              <w:jc w:val="center"/>
+              <w:rPr>
+                <w:rFonts w:ascii="Times New Roman" w:eastAsia="Times New Roman" w:hAnsi="Times New Roman" w:cs="Times New Roman"/>
+                <w:b/>
+                <w:bCs/>
+                <w:sz w:val="24"/>
+                <w:szCs w:val="24"/>
+              </w:rPr>
+            </w:pPr>
+            <w:r>
+              <w:rPr>
+                <w:rFonts w:ascii="Times New Roman" w:eastAsia="Times New Roman" w:hAnsi="Times New Roman" w:cs="Times New Roman"/>
+                <w:b/>
+                <w:bCs/>
+                <w:sz w:val="24"/>
+                <w:szCs w:val="24"/>
+              </w:rPr>
+              <w:t>Module</w:t>
+            </w:r>
+          </w:p>
+        </w:tc>
+      </w:tr>
+      <w:tr>
+        <w:trPr>
+          <w:tblCellSpacing w:w="15" w:type="dxa"/>
+        </w:trPr>
+        <w:tc>
+          <w:tcPr>
+            <w:tcW w:w="0" w:type="auto"/>
+            <w:vAlign w:val="center"/>
+            <w:hideMark/>
+          </w:tcPr>
+          <w:p>
+            <w:pPr>
+              <w:spacing w:after="0" w:line="240" w:lineRule="auto"/>
+              <w:rPr>
+                <w:rFonts w:ascii="Times New Roman" w:eastAsia="Times New Roman" w:hAnsi="Times New Roman" w:cs="Times New Roman"/>
+                <w:sz w:val="24"/>
+                <w:szCs w:val="24"/>
+              </w:rPr>
+            </w:pPr>
+            <w:r>
+              <w:rPr>
+                <w:rFonts w:ascii="Times New Roman" w:eastAsia="Times New Roman" w:hAnsi="Times New Roman" w:cs="Times New Roman"/>
+                <w:sz w:val="24"/>
+                <w:szCs w:val="24"/>
+              </w:rPr>
+              <w:t>8</w:t>
+            </w:r>
+          </w:p>
+        </w:tc>
+        <w:tc>
+          <w:tcPr>
+            <w:tcW w:w="0" w:type="auto"/>
+            <w:vAlign w:val="center"/>
+            <w:hideMark/>
+          </w:tcPr>
+          <w:p>
+            <w:pPr>
+              <w:spacing w:after="0" w:line="240" w:lineRule="auto"/>
+              <w:rPr>
+                <w:rFonts w:ascii="Times New Roman" w:eastAsia="Times New Roman" w:hAnsi="Times New Roman" w:cs="Times New Roman"/>
+                <w:sz w:val="24"/>
+                <w:szCs w:val="24"/>
+              </w:rPr>
+            </w:pPr>
+            <w:r>
+              <w:rPr>
+                <w:rFonts w:ascii="Times New Roman" w:eastAsia="Times New Roman" w:hAnsi="Times New Roman" w:cs="Times New Roman"/>
+                <w:b/>
+                <w:bCs/>
+                <w:sz w:val="24"/>
+                <w:szCs w:val="24"/>
+              </w:rPr>
+              <w:t>Ambulance Management</w:t>
+            </w:r>
+          </w:p>
+        </w:tc>
+      </w:tr>
+      <w:tr>
+        <w:trPr>
+          <w:tblCellSpacing w:w="15" w:type="dxa"/>
+        </w:trPr>
+        <w:tc>
+          <w:tcPr>
+            <w:tcW w:w="0" w:type="auto"/>
+            <w:vAlign w:val="center"/>
+            <w:hideMark/>
+          </w:tcPr>
+          <w:p>
+            <w:pPr>
+              <w:spacing w:after="0" w:line="240" w:lineRule="auto"/>
+              <w:rPr>
+                <w:rFonts w:ascii="Times New Roman" w:eastAsia="Times New Roman" w:hAnsi="Times New Roman" w:cs="Times New Roman"/>
+                <w:sz w:val="24"/>
+                <w:szCs w:val="24"/>
+              </w:rPr>
+            </w:pPr>
+            <w:r>
+              <w:rPr>
+                <w:rFonts w:ascii="Times New Roman" w:eastAsia="Times New Roman" w:hAnsi="Times New Roman" w:cs="Times New Roman"/>
+                <w:sz w:val="24"/>
+                <w:szCs w:val="24"/>
+              </w:rPr>
+              <w:t>9</w:t>
+            </w:r>
+          </w:p>
+        </w:tc>
+        <w:tc>
+          <w:tcPr>
+            <w:tcW w:w="0" w:type="auto"/>
+            <w:vAlign w:val="center"/>
+            <w:hideMark/>
+          </w:tcPr>
+          <w:p>
+            <w:pPr>
+              <w:spacing w:after="0" w:line="240" w:lineRule="auto"/>
+              <w:rPr>
+                <w:rFonts w:ascii="Times New Roman" w:eastAsia="Times New Roman" w:hAnsi="Times New Roman" w:cs="Times New Roman"/>
+                <w:sz w:val="24"/>
+                <w:szCs w:val="24"/>
+              </w:rPr>
+            </w:pPr>
+            <w:r>
+              <w:rPr>
+                <w:rFonts w:ascii="Times New Roman" w:eastAsia="Times New Roman" w:hAnsi="Times New Roman" w:cs="Times New Roman"/>
+                <w:b/>
+                <w:bCs/>
+                <w:sz w:val="24"/>
+                <w:szCs w:val="24"/>
+              </w:rPr>
+              <w:t>Maintenance / Assets</w:t>
+            </w:r>
+          </w:p>
+        </w:tc>
+      </w:tr>
+      <w:tr>
+        <w:trPr>
+          <w:tblCellSpacing w:w="15" w:type="dxa"/>
+        </w:trPr>
+        <w:tc>
+          <w:tcPr>
+            <w:tcW w:w="0" w:type="auto"/>
+            <w:vAlign w:val="center"/>
+            <w:hideMark/>
+          </w:tcPr>
+          <w:p>
+            <w:pPr>
+              <w:spacing w:after="0" w:line="240" w:lineRule="auto"/>
+              <w:rPr>
+                <w:rFonts w:ascii="Times New Roman" w:eastAsia="Times New Roman" w:hAnsi="Times New Roman" w:cs="Times New Roman"/>
+                <w:sz w:val="24"/>
+                <w:szCs w:val="24"/>
+              </w:rPr>
+            </w:pPr>
+            <w:r>
+              <w:rPr>
+                <w:rFonts w:ascii="Times New Roman" w:eastAsia="Times New Roman" w:hAnsi="Times New Roman" w:cs="Times New Roman"/>
+                <w:sz w:val="24"/>
+                <w:szCs w:val="24"/>
+              </w:rPr>
+              <w:t>10</w:t>
+            </w:r>
+          </w:p>
+        </w:tc>
+        <w:tc>
+          <w:tcPr>
+            <w:tcW w:w="0" w:type="auto"/>
+            <w:vAlign w:val="center"/>
+            <w:hideMark/>
+          </w:tcPr>
+          <w:p>
+            <w:pPr>
+              <w:spacing w:after="0" w:line="240" w:lineRule="auto"/>
+              <w:rPr>
+                <w:rFonts w:ascii="Times New Roman" w:eastAsia="Times New Roman" w:hAnsi="Times New Roman" w:cs="Times New Roman"/>
+                <w:sz w:val="24"/>
+                <w:szCs w:val="24"/>
+              </w:rPr>
+            </w:pPr>
+            <w:r>
+              <w:rPr>
+                <w:rFonts w:ascii="Times New Roman" w:eastAsia="Times New Roman" w:hAnsi="Times New Roman" w:cs="Times New Roman"/>
+                <w:b/>
+                <w:bCs/>
+                <w:sz w:val="24"/>
+                <w:szCs w:val="24"/>
+              </w:rPr>
+              <w:t>SMS / Notifications</w:t>
+            </w:r>
+          </w:p>
+        </w:tc>
+      </w:tr>
+    </w:tbl>
     <w:p>
       <w:pPr>
         <w:pStyle w:val="ListParagraph"/>
@@ -1695,6 +3170,119 @@
       </w:rPr>
     </w:lvl>
   </w:abstractNum>
+  <w:abstractNum w:abstractNumId="4">
+    <w:nsid w:val="7C8B3C07"/>
+    <w:multiLevelType w:val="hybridMultilevel"/>
+    <w:tmpl w:val="437AF4A4"/>
+    <w:lvl w:ilvl="0" w:tplc="04090001">
+      <w:start w:val="1"/>
+      <w:numFmt w:val="bullet"/>
+      <w:lvlText w:val=""/>
+      <w:lvlJc w:val="left"/>
+      <w:pPr>
+        <w:ind w:left="720" w:hanging="360"/>
+      </w:pPr>
+      <w:rPr>
+        <w:rFonts w:ascii="Symbol" w:hAnsi="Symbol" w:hint="default"/>
+      </w:rPr>
+    </w:lvl>
+    <w:lvl w:ilvl="1" w:tplc="04090003" w:tentative="1">
+      <w:start w:val="1"/>
+      <w:numFmt w:val="bullet"/>
+      <w:lvlText w:val="o"/>
+      <w:lvlJc w:val="left"/>
+      <w:pPr>
+        <w:ind w:left="1440" w:hanging="360"/>
+      </w:pPr>
+      <w:rPr>
+        <w:rFonts w:ascii="Courier New" w:hAnsi="Courier New" w:cs="Courier New" w:hint="default"/>
+      </w:rPr>
+    </w:lvl>
+    <w:lvl w:ilvl="2" w:tplc="04090005" w:tentative="1">
+      <w:start w:val="1"/>
+      <w:numFmt w:val="bullet"/>
+      <w:lvlText w:val=""/>
+      <w:lvlJc w:val="left"/>
+      <w:pPr>
+        <w:ind w:left="2160" w:hanging="360"/>
+      </w:pPr>
+      <w:rPr>
+        <w:rFonts w:ascii="Wingdings" w:hAnsi="Wingdings" w:hint="default"/>
+      </w:rPr>
+    </w:lvl>
+    <w:lvl w:ilvl="3" w:tplc="04090001" w:tentative="1">
+      <w:start w:val="1"/>
+      <w:numFmt w:val="bullet"/>
+      <w:lvlText w:val=""/>
+      <w:lvlJc w:val="left"/>
+      <w:pPr>
+        <w:ind w:left="2880" w:hanging="360"/>
+      </w:pPr>
+      <w:rPr>
+        <w:rFonts w:ascii="Symbol" w:hAnsi="Symbol" w:hint="default"/>
+      </w:rPr>
+    </w:lvl>
+    <w:lvl w:ilvl="4" w:tplc="04090003" w:tentative="1">
+      <w:start w:val="1"/>
+      <w:numFmt w:val="bullet"/>
+      <w:lvlText w:val="o"/>
+      <w:lvlJc w:val="left"/>
+      <w:pPr>
+        <w:ind w:left="3600" w:hanging="360"/>
+      </w:pPr>
+      <w:rPr>
+        <w:rFonts w:ascii="Courier New" w:hAnsi="Courier New" w:cs="Courier New" w:hint="default"/>
+      </w:rPr>
+    </w:lvl>
+    <w:lvl w:ilvl="5" w:tplc="04090005" w:tentative="1">
+      <w:start w:val="1"/>
+      <w:numFmt w:val="bullet"/>
+      <w:lvlText w:val=""/>
+      <w:lvlJc w:val="left"/>
+      <w:pPr>
+        <w:ind w:left="4320" w:hanging="360"/>
+      </w:pPr>
+      <w:rPr>
+        <w:rFonts w:ascii="Wingdings" w:hAnsi="Wingdings" w:hint="default"/>
+      </w:rPr>
+    </w:lvl>
+    <w:lvl w:ilvl="6" w:tplc="04090001" w:tentative="1">
+      <w:start w:val="1"/>
+      <w:numFmt w:val="bullet"/>
+      <w:lvlText w:val=""/>
+      <w:lvlJc w:val="left"/>
+      <w:pPr>
+        <w:ind w:left="5040" w:hanging="360"/>
+      </w:pPr>
+      <w:rPr>
+        <w:rFonts w:ascii="Symbol" w:hAnsi="Symbol" w:hint="default"/>
+      </w:rPr>
+    </w:lvl>
+    <w:lvl w:ilvl="7" w:tplc="04090003" w:tentative="1">
+      <w:start w:val="1"/>
+      <w:numFmt w:val="bullet"/>
+      <w:lvlText w:val="o"/>
+      <w:lvlJc w:val="left"/>
+      <w:pPr>
+        <w:ind w:left="5760" w:hanging="360"/>
+      </w:pPr>
+      <w:rPr>
+        <w:rFonts w:ascii="Courier New" w:hAnsi="Courier New" w:cs="Courier New" w:hint="default"/>
+      </w:rPr>
+    </w:lvl>
+    <w:lvl w:ilvl="8" w:tplc="04090005" w:tentative="1">
+      <w:start w:val="1"/>
+      <w:numFmt w:val="bullet"/>
+      <w:lvlText w:val=""/>
+      <w:lvlJc w:val="left"/>
+      <w:pPr>
+        <w:ind w:left="6480" w:hanging="360"/>
+      </w:pPr>
+      <w:rPr>
+        <w:rFonts w:ascii="Wingdings" w:hAnsi="Wingdings" w:hint="default"/>
+      </w:rPr>
+    </w:lvl>
+  </w:abstractNum>
   <w:num w:numId="1">
     <w:abstractNumId w:val="3"/>
   </w:num>
@@ -1706,6 +3294,9 @@
   </w:num>
   <w:num w:numId="4">
     <w:abstractNumId w:val="2"/>
+  </w:num>
+  <w:num w:numId="5">
+    <w:abstractNumId w:val="4"/>
   </w:num>
 </w:numbering>
 </file>
@@ -2104,6 +3695,44 @@
     <w:name w:val="Normal"/>
     <w:qFormat/>
   </w:style>
+  <w:style w:type="paragraph" w:styleId="Heading3">
+    <w:name w:val="heading 3"/>
+    <w:basedOn w:val="Normal"/>
+    <w:link w:val="Heading3Char"/>
+    <w:uiPriority w:val="9"/>
+    <w:qFormat/>
+    <w:rsid w:val="00861E5F"/>
+    <w:pPr>
+      <w:spacing w:before="100" w:beforeAutospacing="1" w:after="100" w:afterAutospacing="1" w:line="240" w:lineRule="auto"/>
+      <w:outlineLvl w:val="2"/>
+    </w:pPr>
+    <w:rPr>
+      <w:rFonts w:ascii="Times New Roman" w:eastAsia="Times New Roman" w:hAnsi="Times New Roman" w:cs="Times New Roman"/>
+      <w:b/>
+      <w:bCs/>
+      <w:sz w:val="27"/>
+      <w:szCs w:val="27"/>
+    </w:rPr>
+  </w:style>
+  <w:style w:type="paragraph" w:styleId="Heading4">
+    <w:name w:val="heading 4"/>
+    <w:basedOn w:val="Normal"/>
+    <w:link w:val="Heading4Char"/>
+    <w:uiPriority w:val="9"/>
+    <w:qFormat/>
+    <w:rsid w:val="00861E5F"/>
+    <w:pPr>
+      <w:spacing w:before="100" w:beforeAutospacing="1" w:after="100" w:afterAutospacing="1" w:line="240" w:lineRule="auto"/>
+      <w:outlineLvl w:val="3"/>
+    </w:pPr>
+    <w:rPr>
+      <w:rFonts w:ascii="Times New Roman" w:eastAsia="Times New Roman" w:hAnsi="Times New Roman" w:cs="Times New Roman"/>
+      <w:b/>
+      <w:bCs/>
+      <w:sz w:val="24"/>
+      <w:szCs w:val="24"/>
+    </w:rPr>
+  </w:style>
   <w:style w:type="character" w:default="1" w:styleId="DefaultParagraphFont">
     <w:name w:val="Default Paragraph Font"/>
     <w:uiPriority w:val="1"/>
@@ -2141,6 +3770,45 @@
       <w:ind w:left="720"/>
       <w:contextualSpacing/>
     </w:pPr>
+  </w:style>
+  <w:style w:type="character" w:customStyle="1" w:styleId="Heading3Char">
+    <w:name w:val="Heading 3 Char"/>
+    <w:basedOn w:val="DefaultParagraphFont"/>
+    <w:link w:val="Heading3"/>
+    <w:uiPriority w:val="9"/>
+    <w:rsid w:val="00861E5F"/>
+    <w:rPr>
+      <w:rFonts w:ascii="Times New Roman" w:eastAsia="Times New Roman" w:hAnsi="Times New Roman" w:cs="Times New Roman"/>
+      <w:b/>
+      <w:bCs/>
+      <w:sz w:val="27"/>
+      <w:szCs w:val="27"/>
+    </w:rPr>
+  </w:style>
+  <w:style w:type="character" w:customStyle="1" w:styleId="Heading4Char">
+    <w:name w:val="Heading 4 Char"/>
+    <w:basedOn w:val="DefaultParagraphFont"/>
+    <w:link w:val="Heading4"/>
+    <w:uiPriority w:val="9"/>
+    <w:rsid w:val="00861E5F"/>
+    <w:rPr>
+      <w:rFonts w:ascii="Times New Roman" w:eastAsia="Times New Roman" w:hAnsi="Times New Roman" w:cs="Times New Roman"/>
+      <w:b/>
+      <w:bCs/>
+      <w:sz w:val="24"/>
+      <w:szCs w:val="24"/>
+    </w:rPr>
+  </w:style>
+  <w:style w:type="character" w:styleId="Strong">
+    <w:name w:val="Strong"/>
+    <w:basedOn w:val="DefaultParagraphFont"/>
+    <w:uiPriority w:val="22"/>
+    <w:qFormat/>
+    <w:rsid w:val="00861E5F"/>
+    <w:rPr>
+      <w:b/>
+      <w:bCs/>
+    </w:rPr>
   </w:style>
 </w:styles>
 </file>

</xml_diff>

<commit_message>
billing module fully complete service charge work
</commit_message>
<xml_diff>
--- a/Requirements .docx
+++ b/Requirements .docx
@@ -119,7 +119,7 @@
           <w:sz w:val="22"/>
           <w:shd w:fill="auto" w:val="clear"/>
         </w:rPr>
-        <w:t xml:space="preserve">In the wards and beds when we discharge a patient how we know that we discharge this patient</w:t>
+        <w:t xml:space="preserve">We make the modules </w:t>
       </w:r>
     </w:p>
     <w:p>
@@ -129,27 +129,29 @@
           <w:numId w:val="2"/>
         </w:numPr>
         <w:spacing w:before="0" w:after="160" w:line="259"/>
-        <w:ind w:right="0" w:left="720" w:hanging="360"/>
-        <w:jc w:val="left"/>
-        <w:rPr>
-          <w:rFonts w:ascii="Calibri" w:hAnsi="Calibri" w:cs="Calibri" w:eastAsia="Calibri"/>
-          <w:color w:val="auto"/>
-          <w:spacing w:val="0"/>
-          <w:position w:val="0"/>
-          <w:sz w:val="22"/>
-          <w:shd w:fill="auto" w:val="clear"/>
-        </w:rPr>
-      </w:pPr>
-      <w:r>
-        <w:rPr>
-          <w:rFonts w:ascii="Calibri" w:hAnsi="Calibri" w:cs="Calibri" w:eastAsia="Calibri"/>
-          <w:color w:val="auto"/>
-          <w:spacing w:val="0"/>
-          <w:position w:val="0"/>
-          <w:sz w:val="22"/>
-          <w:shd w:fill="auto" w:val="clear"/>
-        </w:rPr>
-        <w:t xml:space="preserve">We make the modules </w:t>
+        <w:ind w:right="0" w:left="1440" w:hanging="360"/>
+        <w:jc w:val="left"/>
+        <w:rPr>
+          <w:rFonts w:ascii="Calibri" w:hAnsi="Calibri" w:cs="Calibri" w:eastAsia="Calibri"/>
+          <w:b/>
+          <w:color w:val="auto"/>
+          <w:spacing w:val="0"/>
+          <w:position w:val="0"/>
+          <w:sz w:val="22"/>
+          <w:shd w:fill="auto" w:val="clear"/>
+        </w:rPr>
+      </w:pPr>
+      <w:r>
+        <w:rPr>
+          <w:rFonts w:ascii="Calibri" w:hAnsi="Calibri" w:cs="Calibri" w:eastAsia="Calibri"/>
+          <w:b/>
+          <w:color w:val="auto"/>
+          <w:spacing w:val="0"/>
+          <w:position w:val="0"/>
+          <w:sz w:val="22"/>
+          <w:shd w:fill="auto" w:val="clear"/>
+        </w:rPr>
+        <w:t xml:space="preserve">Doctors</w:t>
       </w:r>
     </w:p>
     <w:p>
@@ -181,7 +183,7 @@
           <w:sz w:val="22"/>
           <w:shd w:fill="auto" w:val="clear"/>
         </w:rPr>
-        <w:t xml:space="preserve">Doctors</w:t>
+        <w:t xml:space="preserve">Patients</w:t>
       </w:r>
     </w:p>
     <w:p>
@@ -213,7 +215,7 @@
           <w:sz w:val="22"/>
           <w:shd w:fill="auto" w:val="clear"/>
         </w:rPr>
-        <w:t xml:space="preserve">Patients</w:t>
+        <w:t xml:space="preserve">Appointments</w:t>
       </w:r>
     </w:p>
     <w:p>
@@ -245,7 +247,7 @@
           <w:sz w:val="22"/>
           <w:shd w:fill="auto" w:val="clear"/>
         </w:rPr>
-        <w:t xml:space="preserve">Appointments</w:t>
+        <w:t xml:space="preserve">Wards and Beds</w:t>
       </w:r>
     </w:p>
     <w:p>
@@ -277,7 +279,7 @@
           <w:sz w:val="22"/>
           <w:shd w:fill="auto" w:val="clear"/>
         </w:rPr>
-        <w:t xml:space="preserve">Wards and Beds</w:t>
+        <w:t xml:space="preserve">Medicine</w:t>
       </w:r>
     </w:p>
     <w:p>
@@ -309,7 +311,7 @@
           <w:sz w:val="22"/>
           <w:shd w:fill="auto" w:val="clear"/>
         </w:rPr>
-        <w:t xml:space="preserve">Medicine</w:t>
+        <w:t xml:space="preserve">Prescriptions</w:t>
       </w:r>
     </w:p>
     <w:p>
@@ -341,7 +343,7 @@
           <w:sz w:val="22"/>
           <w:shd w:fill="auto" w:val="clear"/>
         </w:rPr>
-        <w:t xml:space="preserve">Prescriptions</w:t>
+        <w:t xml:space="preserve">Lab Orders</w:t>
       </w:r>
     </w:p>
     <w:p>
@@ -373,7 +375,7 @@
           <w:sz w:val="22"/>
           <w:shd w:fill="auto" w:val="clear"/>
         </w:rPr>
-        <w:t xml:space="preserve">Lab Orders</w:t>
+        <w:t xml:space="preserve">Radiology</w:t>
       </w:r>
     </w:p>
     <w:p>
@@ -405,7 +407,39 @@
           <w:sz w:val="22"/>
           <w:shd w:fill="auto" w:val="clear"/>
         </w:rPr>
-        <w:t xml:space="preserve">Radiology</w:t>
+        <w:t xml:space="preserve">billing </w:t>
+      </w:r>
+    </w:p>
+    <w:p>
+      <w:pPr>
+        <w:numPr>
+          <w:ilvl w:val="0"/>
+          <w:numId w:val="2"/>
+        </w:numPr>
+        <w:spacing w:before="0" w:after="160" w:line="259"/>
+        <w:ind w:right="0" w:left="1440" w:hanging="360"/>
+        <w:jc w:val="left"/>
+        <w:rPr>
+          <w:rFonts w:ascii="Calibri" w:hAnsi="Calibri" w:cs="Calibri" w:eastAsia="Calibri"/>
+          <w:b/>
+          <w:color w:val="auto"/>
+          <w:spacing w:val="0"/>
+          <w:position w:val="0"/>
+          <w:sz w:val="22"/>
+          <w:shd w:fill="auto" w:val="clear"/>
+        </w:rPr>
+      </w:pPr>
+      <w:r>
+        <w:rPr>
+          <w:rFonts w:ascii="Calibri" w:hAnsi="Calibri" w:cs="Calibri" w:eastAsia="Calibri"/>
+          <w:b/>
+          <w:color w:val="auto"/>
+          <w:spacing w:val="0"/>
+          <w:position w:val="0"/>
+          <w:sz w:val="22"/>
+          <w:shd w:fill="auto" w:val="clear"/>
+        </w:rPr>
+        <w:t xml:space="preserve">employees</w:t>
       </w:r>
     </w:p>
     <w:p>
@@ -703,6 +737,38 @@
           <w:shd w:fill="auto" w:val="clear"/>
         </w:rPr>
         <w:t xml:space="preserve">there is one file show is missing in the dispensing so make it </w:t>
+      </w:r>
+    </w:p>
+    <w:p>
+      <w:pPr>
+        <w:numPr>
+          <w:ilvl w:val="0"/>
+          <w:numId w:val="6"/>
+        </w:numPr>
+        <w:spacing w:before="0" w:after="160" w:line="259"/>
+        <w:ind w:right="0" w:left="720" w:hanging="360"/>
+        <w:jc w:val="left"/>
+        <w:rPr>
+          <w:rFonts w:ascii="Calibri" w:hAnsi="Calibri" w:cs="Calibri" w:eastAsia="Calibri"/>
+          <w:b/>
+          <w:color w:val="auto"/>
+          <w:spacing w:val="0"/>
+          <w:position w:val="0"/>
+          <w:sz w:val="22"/>
+          <w:shd w:fill="auto" w:val="clear"/>
+        </w:rPr>
+      </w:pPr>
+      <w:r>
+        <w:rPr>
+          <w:rFonts w:ascii="Calibri" w:hAnsi="Calibri" w:cs="Calibri" w:eastAsia="Calibri"/>
+          <w:b/>
+          <w:color w:val="auto"/>
+          <w:spacing w:val="0"/>
+          <w:position w:val="0"/>
+          <w:sz w:val="22"/>
+          <w:shd w:fill="auto" w:val="clear"/>
+        </w:rPr>
+        <w:t xml:space="preserve">in the add medicine during the add of require prescribtion there is the bug when clcick on the checkbox and then add the prescribtion then give the error </w:t>
       </w:r>
     </w:p>
     <w:p>

</xml_diff>

<commit_message>
Fix add medicine checkbox error
</commit_message>
<xml_diff>
--- a/Requirements .docx
+++ b/Requirements .docx
@@ -489,6 +489,230 @@
     </w:p>
     <w:p>
       <w:pPr>
+        <w:numPr>
+          <w:ilvl w:val="0"/>
+          <w:numId w:val="5"/>
+        </w:numPr>
+        <w:spacing w:before="0" w:after="160" w:line="259"/>
+        <w:ind w:right="0" w:left="360" w:hanging="360"/>
+        <w:jc w:val="left"/>
+        <w:rPr>
+          <w:rFonts w:ascii="Calibri" w:hAnsi="Calibri" w:cs="Calibri" w:eastAsia="Calibri"/>
+          <w:b/>
+          <w:color w:val="auto"/>
+          <w:spacing w:val="0"/>
+          <w:position w:val="0"/>
+          <w:sz w:val="22"/>
+          <w:shd w:fill="auto" w:val="clear"/>
+        </w:rPr>
+      </w:pPr>
+      <w:r>
+        <w:rPr>
+          <w:rFonts w:ascii="Calibri" w:hAnsi="Calibri" w:cs="Calibri" w:eastAsia="Calibri"/>
+          <w:b/>
+          <w:color w:val="auto"/>
+          <w:spacing w:val="0"/>
+          <w:position w:val="0"/>
+          <w:sz w:val="22"/>
+          <w:shd w:fill="auto" w:val="clear"/>
+        </w:rPr>
+        <w:t xml:space="preserve">when the tests Radiology performs the results will be show to the doctor there will be the dashboard for the doctors to see the patient histories and tests Radiology reposts </w:t>
+      </w:r>
+    </w:p>
+    <w:p>
+      <w:pPr>
+        <w:numPr>
+          <w:ilvl w:val="0"/>
+          <w:numId w:val="5"/>
+        </w:numPr>
+        <w:spacing w:before="0" w:after="160" w:line="259"/>
+        <w:ind w:right="0" w:left="360" w:hanging="360"/>
+        <w:jc w:val="left"/>
+        <w:rPr>
+          <w:rFonts w:ascii="Calibri" w:hAnsi="Calibri" w:cs="Calibri" w:eastAsia="Calibri"/>
+          <w:b/>
+          <w:color w:val="auto"/>
+          <w:spacing w:val="0"/>
+          <w:position w:val="0"/>
+          <w:sz w:val="22"/>
+          <w:shd w:fill="auto" w:val="clear"/>
+        </w:rPr>
+      </w:pPr>
+      <w:r>
+        <w:rPr>
+          <w:rFonts w:ascii="Calibri" w:hAnsi="Calibri" w:cs="Calibri" w:eastAsia="Calibri"/>
+          <w:b/>
+          <w:color w:val="auto"/>
+          <w:spacing w:val="0"/>
+          <w:position w:val="0"/>
+          <w:sz w:val="22"/>
+          <w:shd w:fill="auto" w:val="clear"/>
+        </w:rPr>
+        <w:t xml:space="preserve">There is the problem in the prescription because when we dispense the medicines the amount have added when we add the stock so need to manage this module </w:t>
+      </w:r>
+    </w:p>
+    <w:p>
+      <w:pPr>
+        <w:numPr>
+          <w:ilvl w:val="0"/>
+          <w:numId w:val="5"/>
+        </w:numPr>
+        <w:spacing w:before="0" w:after="160" w:line="259"/>
+        <w:ind w:right="0" w:left="360" w:hanging="360"/>
+        <w:jc w:val="left"/>
+        <w:rPr>
+          <w:rFonts w:ascii="Calibri" w:hAnsi="Calibri" w:cs="Calibri" w:eastAsia="Calibri"/>
+          <w:b/>
+          <w:color w:val="auto"/>
+          <w:spacing w:val="0"/>
+          <w:position w:val="0"/>
+          <w:sz w:val="22"/>
+          <w:shd w:fill="auto" w:val="clear"/>
+        </w:rPr>
+      </w:pPr>
+      <w:r>
+        <w:rPr>
+          <w:rFonts w:ascii="Calibri" w:hAnsi="Calibri" w:cs="Calibri" w:eastAsia="Calibri"/>
+          <w:b/>
+          <w:color w:val="auto"/>
+          <w:spacing w:val="0"/>
+          <w:position w:val="0"/>
+          <w:sz w:val="22"/>
+          <w:shd w:fill="auto" w:val="clear"/>
+        </w:rPr>
+        <w:t xml:space="preserve">In the radiology when find some thing critical then need to make the system like this to notify by the doctor</w:t>
+      </w:r>
+    </w:p>
+    <w:p>
+      <w:pPr>
+        <w:numPr>
+          <w:ilvl w:val="0"/>
+          <w:numId w:val="5"/>
+        </w:numPr>
+        <w:spacing w:before="0" w:after="160" w:line="259"/>
+        <w:ind w:right="0" w:left="360" w:hanging="360"/>
+        <w:jc w:val="left"/>
+        <w:rPr>
+          <w:rFonts w:ascii="Calibri" w:hAnsi="Calibri" w:cs="Calibri" w:eastAsia="Calibri"/>
+          <w:b/>
+          <w:color w:val="auto"/>
+          <w:spacing w:val="0"/>
+          <w:position w:val="0"/>
+          <w:sz w:val="22"/>
+          <w:shd w:fill="auto" w:val="clear"/>
+        </w:rPr>
+      </w:pPr>
+      <w:r>
+        <w:rPr>
+          <w:rFonts w:ascii="Calibri" w:hAnsi="Calibri" w:cs="Calibri" w:eastAsia="Calibri"/>
+          <w:b/>
+          <w:color w:val="auto"/>
+          <w:spacing w:val="0"/>
+          <w:position w:val="0"/>
+          <w:sz w:val="22"/>
+          <w:shd w:fill="auto" w:val="clear"/>
+        </w:rPr>
+        <w:t xml:space="preserve">We will make the doctor module to perform the test and to notify by radiology department to notify the doctor there will be a notification for the doctor </w:t>
+      </w:r>
+    </w:p>
+    <w:p>
+      <w:pPr>
+        <w:numPr>
+          <w:ilvl w:val="0"/>
+          <w:numId w:val="5"/>
+        </w:numPr>
+        <w:spacing w:before="0" w:after="160" w:line="259"/>
+        <w:ind w:right="0" w:left="360" w:hanging="360"/>
+        <w:jc w:val="left"/>
+        <w:rPr>
+          <w:rFonts w:ascii="Calibri" w:hAnsi="Calibri" w:cs="Calibri" w:eastAsia="Calibri"/>
+          <w:b/>
+          <w:color w:val="auto"/>
+          <w:spacing w:val="0"/>
+          <w:position w:val="0"/>
+          <w:sz w:val="22"/>
+          <w:shd w:fill="auto" w:val="clear"/>
+        </w:rPr>
+      </w:pPr>
+      <w:r>
+        <w:rPr>
+          <w:rFonts w:ascii="Calibri" w:hAnsi="Calibri" w:cs="Calibri" w:eastAsia="Calibri"/>
+          <w:b/>
+          <w:color w:val="auto"/>
+          <w:spacing w:val="0"/>
+          <w:position w:val="0"/>
+          <w:sz w:val="22"/>
+          <w:shd w:fill="auto" w:val="clear"/>
+        </w:rPr>
+        <w:t xml:space="preserve">In the Billing module when we click on the load pending and it show the pending bills  if we click multiple time it make the same so this error should be resolve if the pending bills already select then did not create the duplicate </w:t>
+      </w:r>
+    </w:p>
+    <w:p>
+      <w:pPr>
+        <w:numPr>
+          <w:ilvl w:val="0"/>
+          <w:numId w:val="5"/>
+        </w:numPr>
+        <w:spacing w:before="0" w:after="160" w:line="259"/>
+        <w:ind w:right="0" w:left="360" w:hanging="360"/>
+        <w:jc w:val="left"/>
+        <w:rPr>
+          <w:rFonts w:ascii="Calibri" w:hAnsi="Calibri" w:cs="Calibri" w:eastAsia="Calibri"/>
+          <w:b/>
+          <w:color w:val="auto"/>
+          <w:spacing w:val="0"/>
+          <w:position w:val="0"/>
+          <w:sz w:val="22"/>
+          <w:shd w:fill="auto" w:val="clear"/>
+        </w:rPr>
+      </w:pPr>
+      <w:r>
+        <w:rPr>
+          <w:rFonts w:ascii="Calibri" w:hAnsi="Calibri" w:cs="Calibri" w:eastAsia="Calibri"/>
+          <w:b/>
+          <w:color w:val="auto"/>
+          <w:spacing w:val="0"/>
+          <w:position w:val="0"/>
+          <w:sz w:val="22"/>
+          <w:shd w:fill="auto" w:val="clear"/>
+        </w:rPr>
+        <w:t xml:space="preserve">Blood price automatic generate so should be resolve this issue we decide the price for the pack</w:t>
+      </w:r>
+    </w:p>
+    <w:p>
+      <w:pPr>
+        <w:numPr>
+          <w:ilvl w:val="0"/>
+          <w:numId w:val="5"/>
+        </w:numPr>
+        <w:spacing w:before="0" w:after="160" w:line="259"/>
+        <w:ind w:right="0" w:left="360" w:hanging="360"/>
+        <w:jc w:val="left"/>
+        <w:rPr>
+          <w:rFonts w:ascii="Calibri" w:hAnsi="Calibri" w:cs="Calibri" w:eastAsia="Calibri"/>
+          <w:b/>
+          <w:color w:val="auto"/>
+          <w:spacing w:val="0"/>
+          <w:position w:val="0"/>
+          <w:sz w:val="22"/>
+          <w:shd w:fill="auto" w:val="clear"/>
+        </w:rPr>
+      </w:pPr>
+      <w:r>
+        <w:rPr>
+          <w:rFonts w:ascii="Calibri" w:hAnsi="Calibri" w:cs="Calibri" w:eastAsia="Calibri"/>
+          <w:b/>
+          <w:color w:val="auto"/>
+          <w:spacing w:val="0"/>
+          <w:position w:val="0"/>
+          <w:sz w:val="22"/>
+          <w:shd w:fill="auto" w:val="clear"/>
+        </w:rPr>
+        <w:t xml:space="preserve">error  when the patient are admitted and if the patient have 1.5 days the billing generate load bills according to the time they spend but we need to manage this thing because it will cause bugs</w:t>
+      </w:r>
+    </w:p>
+    <w:p>
+      <w:pPr>
         <w:spacing w:before="0" w:after="160" w:line="259"/>
         <w:ind w:right="0" w:left="0" w:firstLine="0"/>
         <w:jc w:val="left"/>
@@ -502,274 +726,6 @@
           <w:shd w:fill="auto" w:val="clear"/>
         </w:rPr>
       </w:pPr>
-      <w:r>
-        <w:rPr>
-          <w:rFonts w:ascii="Calibri" w:hAnsi="Calibri" w:cs="Calibri" w:eastAsia="Calibri"/>
-          <w:b/>
-          <w:color w:val="auto"/>
-          <w:spacing w:val="0"/>
-          <w:position w:val="0"/>
-          <w:sz w:val="22"/>
-          <w:shd w:fill="auto" w:val="clear"/>
-        </w:rPr>
-        <w:t xml:space="preserve">when the tests Radiology performs the results will be show to the doctor there will be the dashboard for the doctors to see the patient histories and tests Radiology reposts </w:t>
-      </w:r>
-    </w:p>
-    <w:p>
-      <w:pPr>
-        <w:numPr>
-          <w:ilvl w:val="0"/>
-          <w:numId w:val="6"/>
-        </w:numPr>
-        <w:spacing w:before="0" w:after="160" w:line="259"/>
-        <w:ind w:right="0" w:left="720" w:hanging="360"/>
-        <w:jc w:val="left"/>
-        <w:rPr>
-          <w:rFonts w:ascii="Calibri" w:hAnsi="Calibri" w:cs="Calibri" w:eastAsia="Calibri"/>
-          <w:b/>
-          <w:color w:val="auto"/>
-          <w:spacing w:val="0"/>
-          <w:position w:val="0"/>
-          <w:sz w:val="22"/>
-          <w:shd w:fill="auto" w:val="clear"/>
-        </w:rPr>
-      </w:pPr>
-      <w:r>
-        <w:rPr>
-          <w:rFonts w:ascii="Calibri" w:hAnsi="Calibri" w:cs="Calibri" w:eastAsia="Calibri"/>
-          <w:b/>
-          <w:color w:val="auto"/>
-          <w:spacing w:val="0"/>
-          <w:position w:val="0"/>
-          <w:sz w:val="22"/>
-          <w:shd w:fill="auto" w:val="clear"/>
-        </w:rPr>
-        <w:t xml:space="preserve">There is the problem in the prescription because when we dispense the medicines the amount have added when we add the stock so need to manage this module </w:t>
-      </w:r>
-    </w:p>
-    <w:p>
-      <w:pPr>
-        <w:numPr>
-          <w:ilvl w:val="0"/>
-          <w:numId w:val="6"/>
-        </w:numPr>
-        <w:spacing w:before="0" w:after="160" w:line="259"/>
-        <w:ind w:right="0" w:left="720" w:hanging="360"/>
-        <w:jc w:val="left"/>
-        <w:rPr>
-          <w:rFonts w:ascii="Calibri" w:hAnsi="Calibri" w:cs="Calibri" w:eastAsia="Calibri"/>
-          <w:b/>
-          <w:color w:val="auto"/>
-          <w:spacing w:val="0"/>
-          <w:position w:val="0"/>
-          <w:sz w:val="22"/>
-          <w:shd w:fill="auto" w:val="clear"/>
-        </w:rPr>
-      </w:pPr>
-      <w:r>
-        <w:rPr>
-          <w:rFonts w:ascii="Calibri" w:hAnsi="Calibri" w:cs="Calibri" w:eastAsia="Calibri"/>
-          <w:b/>
-          <w:color w:val="auto"/>
-          <w:spacing w:val="0"/>
-          <w:position w:val="0"/>
-          <w:sz w:val="22"/>
-          <w:shd w:fill="auto" w:val="clear"/>
-        </w:rPr>
-        <w:t xml:space="preserve">In the radiology when find some thing critical then need to make the system like this to notify by the doctor</w:t>
-      </w:r>
-    </w:p>
-    <w:p>
-      <w:pPr>
-        <w:numPr>
-          <w:ilvl w:val="0"/>
-          <w:numId w:val="6"/>
-        </w:numPr>
-        <w:spacing w:before="0" w:after="160" w:line="259"/>
-        <w:ind w:right="0" w:left="720" w:hanging="360"/>
-        <w:jc w:val="left"/>
-        <w:rPr>
-          <w:rFonts w:ascii="Calibri" w:hAnsi="Calibri" w:cs="Calibri" w:eastAsia="Calibri"/>
-          <w:b/>
-          <w:color w:val="auto"/>
-          <w:spacing w:val="0"/>
-          <w:position w:val="0"/>
-          <w:sz w:val="22"/>
-          <w:shd w:fill="auto" w:val="clear"/>
-        </w:rPr>
-      </w:pPr>
-      <w:r>
-        <w:rPr>
-          <w:rFonts w:ascii="Calibri" w:hAnsi="Calibri" w:cs="Calibri" w:eastAsia="Calibri"/>
-          <w:b/>
-          <w:color w:val="auto"/>
-          <w:spacing w:val="0"/>
-          <w:position w:val="0"/>
-          <w:sz w:val="22"/>
-          <w:shd w:fill="auto" w:val="clear"/>
-        </w:rPr>
-        <w:t xml:space="preserve">We will make the doctor module to perform the test and to notify by radiology department to notify the doctor there will be a notification for the doctor </w:t>
-      </w:r>
-    </w:p>
-    <w:p>
-      <w:pPr>
-        <w:numPr>
-          <w:ilvl w:val="0"/>
-          <w:numId w:val="6"/>
-        </w:numPr>
-        <w:spacing w:before="0" w:after="160" w:line="259"/>
-        <w:ind w:right="0" w:left="720" w:hanging="360"/>
-        <w:jc w:val="left"/>
-        <w:rPr>
-          <w:rFonts w:ascii="Calibri" w:hAnsi="Calibri" w:cs="Calibri" w:eastAsia="Calibri"/>
-          <w:b/>
-          <w:color w:val="auto"/>
-          <w:spacing w:val="0"/>
-          <w:position w:val="0"/>
-          <w:sz w:val="22"/>
-          <w:shd w:fill="auto" w:val="clear"/>
-        </w:rPr>
-      </w:pPr>
-      <w:r>
-        <w:rPr>
-          <w:rFonts w:ascii="Calibri" w:hAnsi="Calibri" w:cs="Calibri" w:eastAsia="Calibri"/>
-          <w:b/>
-          <w:color w:val="auto"/>
-          <w:spacing w:val="0"/>
-          <w:position w:val="0"/>
-          <w:sz w:val="22"/>
-          <w:shd w:fill="auto" w:val="clear"/>
-        </w:rPr>
-        <w:t xml:space="preserve">In the Billing module when we click on the load pending and it show the pending bills  if we click multiple time it make the same so this error should be resolve if the pending bills already select then did not create the duplicate </w:t>
-      </w:r>
-    </w:p>
-    <w:p>
-      <w:pPr>
-        <w:numPr>
-          <w:ilvl w:val="0"/>
-          <w:numId w:val="6"/>
-        </w:numPr>
-        <w:spacing w:before="0" w:after="160" w:line="259"/>
-        <w:ind w:right="0" w:left="720" w:hanging="360"/>
-        <w:jc w:val="left"/>
-        <w:rPr>
-          <w:rFonts w:ascii="Calibri" w:hAnsi="Calibri" w:cs="Calibri" w:eastAsia="Calibri"/>
-          <w:b/>
-          <w:color w:val="auto"/>
-          <w:spacing w:val="0"/>
-          <w:position w:val="0"/>
-          <w:sz w:val="22"/>
-          <w:shd w:fill="auto" w:val="clear"/>
-        </w:rPr>
-      </w:pPr>
-      <w:r>
-        <w:rPr>
-          <w:rFonts w:ascii="Calibri" w:hAnsi="Calibri" w:cs="Calibri" w:eastAsia="Calibri"/>
-          <w:b/>
-          <w:color w:val="auto"/>
-          <w:spacing w:val="0"/>
-          <w:position w:val="0"/>
-          <w:sz w:val="22"/>
-          <w:shd w:fill="auto" w:val="clear"/>
-        </w:rPr>
-        <w:t xml:space="preserve">Blood price automatic generate so should be resolve this issue we decide the price for the pack</w:t>
-      </w:r>
-    </w:p>
-    <w:p>
-      <w:pPr>
-        <w:numPr>
-          <w:ilvl w:val="0"/>
-          <w:numId w:val="6"/>
-        </w:numPr>
-        <w:spacing w:before="0" w:after="160" w:line="259"/>
-        <w:ind w:right="0" w:left="720" w:hanging="360"/>
-        <w:jc w:val="left"/>
-        <w:rPr>
-          <w:rFonts w:ascii="Calibri" w:hAnsi="Calibri" w:cs="Calibri" w:eastAsia="Calibri"/>
-          <w:b/>
-          <w:color w:val="auto"/>
-          <w:spacing w:val="0"/>
-          <w:position w:val="0"/>
-          <w:sz w:val="22"/>
-          <w:shd w:fill="auto" w:val="clear"/>
-        </w:rPr>
-      </w:pPr>
-      <w:r>
-        <w:rPr>
-          <w:rFonts w:ascii="Calibri" w:hAnsi="Calibri" w:cs="Calibri" w:eastAsia="Calibri"/>
-          <w:b/>
-          <w:color w:val="auto"/>
-          <w:spacing w:val="0"/>
-          <w:position w:val="0"/>
-          <w:sz w:val="22"/>
-          <w:shd w:fill="auto" w:val="clear"/>
-        </w:rPr>
-        <w:t xml:space="preserve">error  when the patient are admitted and if the patient have 1.5 days the billing generate load bills according to the time they spend but we need to manage this thing because it will cause bugs</w:t>
-      </w:r>
-    </w:p>
-    <w:p>
-      <w:pPr>
-        <w:numPr>
-          <w:ilvl w:val="0"/>
-          <w:numId w:val="6"/>
-        </w:numPr>
-        <w:spacing w:before="0" w:after="160" w:line="259"/>
-        <w:ind w:right="0" w:left="720" w:hanging="360"/>
-        <w:jc w:val="left"/>
-        <w:rPr>
-          <w:rFonts w:ascii="Calibri" w:hAnsi="Calibri" w:cs="Calibri" w:eastAsia="Calibri"/>
-          <w:b/>
-          <w:color w:val="auto"/>
-          <w:spacing w:val="0"/>
-          <w:position w:val="0"/>
-          <w:sz w:val="22"/>
-          <w:shd w:fill="auto" w:val="clear"/>
-        </w:rPr>
-      </w:pPr>
-      <w:r>
-        <w:rPr>
-          <w:rFonts w:ascii="Calibri" w:hAnsi="Calibri" w:cs="Calibri" w:eastAsia="Calibri"/>
-          <w:b/>
-          <w:color w:val="auto"/>
-          <w:spacing w:val="0"/>
-          <w:position w:val="0"/>
-          <w:sz w:val="22"/>
-          <w:shd w:fill="auto" w:val="clear"/>
-        </w:rPr>
-        <w:t xml:space="preserve">there is one file show is missing in the dispensing so make it </w:t>
-      </w:r>
-    </w:p>
-    <w:p>
-      <w:pPr>
-        <w:numPr>
-          <w:ilvl w:val="0"/>
-          <w:numId w:val="6"/>
-        </w:numPr>
-        <w:spacing w:before="0" w:after="160" w:line="259"/>
-        <w:ind w:right="0" w:left="720" w:hanging="360"/>
-        <w:jc w:val="left"/>
-        <w:rPr>
-          <w:rFonts w:ascii="Calibri" w:hAnsi="Calibri" w:cs="Calibri" w:eastAsia="Calibri"/>
-          <w:b/>
-          <w:color w:val="auto"/>
-          <w:spacing w:val="0"/>
-          <w:position w:val="0"/>
-          <w:sz w:val="22"/>
-          <w:shd w:fill="auto" w:val="clear"/>
-        </w:rPr>
-      </w:pPr>
-      <w:r>
-        <w:rPr>
-          <w:rFonts w:ascii="Calibri" w:hAnsi="Calibri" w:cs="Calibri" w:eastAsia="Calibri"/>
-          <w:b/>
-          <w:color w:val="auto"/>
-          <w:spacing w:val="0"/>
-          <w:position w:val="0"/>
-          <w:sz w:val="22"/>
-          <w:shd w:fill="auto" w:val="clear"/>
-        </w:rPr>
-        <w:t xml:space="preserve">in the add medicine during the add of require prescribtion there is the bug when clcick on the checkbox and then add the prescribtion then give the error </w:t>
-      </w:r>
     </w:p>
     <w:p>
       <w:pPr>
@@ -3884,7 +3840,7 @@
   <w:num w:numId="2">
     <w:abstractNumId w:val="18"/>
   </w:num>
-  <w:num w:numId="6">
+  <w:num w:numId="5">
     <w:abstractNumId w:val="12"/>
   </w:num>
   <w:num w:numId="45">

</xml_diff>

<commit_message>
Mortuary and death certificate module has been complited
</commit_message>
<xml_diff>
--- a/Requirements .docx
+++ b/Requirements .docx
@@ -448,73 +448,8 @@
         </w:rPr>
         <w:t xml:space="preserve">ology department to notify the doctor there will be a notification for the doctor </w:t>
       </w:r>
-    </w:p>
-    <w:p>
-      <w:pPr>
-        <w:numPr>
-          <w:ilvl w:val="0"/>
-          <w:numId w:val="2"/>
-        </w:numPr>
-        <w:ind w:left="360" w:hanging="360"/>
-        <w:rPr>
-          <w:rFonts w:ascii="Calibri" w:eastAsia="Calibri" w:hAnsi="Calibri" w:cs="Calibri"/>
-          <w:b/>
-        </w:rPr>
-      </w:pPr>
-      <w:r>
-        <w:rPr>
-          <w:rFonts w:ascii="Calibri" w:eastAsia="Calibri" w:hAnsi="Calibri" w:cs="Calibri"/>
-          <w:b/>
-        </w:rPr>
-        <w:t>In the Billing module when we click on the load pending and it show the pending bills  if we click multiple time it make the same so this error should be resolve if the pend</w:t>
-      </w:r>
-      <w:r>
-        <w:rPr>
-          <w:rFonts w:ascii="Calibri" w:eastAsia="Calibri" w:hAnsi="Calibri" w:cs="Calibri"/>
-          <w:b/>
-        </w:rPr>
-        <w:t xml:space="preserve">ing bills already select then did not create the duplicate </w:t>
-      </w:r>
-    </w:p>
-    <w:p>
-      <w:pPr>
-        <w:numPr>
-          <w:ilvl w:val="0"/>
-          <w:numId w:val="2"/>
-        </w:numPr>
-        <w:ind w:left="360" w:hanging="360"/>
-        <w:rPr>
-          <w:rFonts w:ascii="Calibri" w:eastAsia="Calibri" w:hAnsi="Calibri" w:cs="Calibri"/>
-          <w:b/>
-        </w:rPr>
-      </w:pPr>
-      <w:r>
-        <w:rPr>
-          <w:rFonts w:ascii="Calibri" w:eastAsia="Calibri" w:hAnsi="Calibri" w:cs="Calibri"/>
-          <w:b/>
-        </w:rPr>
-        <w:t>in the record blood donation collected in the staff show all the employees we will select the specific one who are the authorize</w:t>
-      </w:r>
       <w:bookmarkStart w:id="0" w:name="_GoBack"/>
       <w:bookmarkEnd w:id="0"/>
-    </w:p>
-    <w:p>
-      <w:pPr>
-        <w:ind w:left="1440"/>
-        <w:rPr>
-          <w:rFonts w:ascii="Calibri" w:eastAsia="Calibri" w:hAnsi="Calibri" w:cs="Calibri"/>
-          <w:b/>
-        </w:rPr>
-      </w:pPr>
-    </w:p>
-    <w:p>
-      <w:pPr>
-        <w:ind w:left="1440"/>
-        <w:rPr>
-          <w:rFonts w:ascii="Calibri" w:eastAsia="Calibri" w:hAnsi="Calibri" w:cs="Calibri"/>
-          <w:b/>
-        </w:rPr>
-      </w:pPr>
     </w:p>
     <w:p>
       <w:pPr>
@@ -574,6 +509,7 @@
           <w:b/>
           <w:sz w:val="27"/>
         </w:rPr>
+        <w:lastRenderedPageBreak/>
         <w:t>Ab</w:t>
       </w:r>
       <w:proofErr w:type="spellEnd"/>
@@ -2760,166 +2696,166 @@
           <w:b/>
           <w:sz w:val="28"/>
         </w:rPr>
+        <w:t>Har</w:t>
+      </w:r>
+      <w:proofErr w:type="spellEnd"/>
+      <w:r>
+        <w:rPr>
+          <w:rFonts w:ascii="Calibri" w:eastAsia="Calibri" w:hAnsi="Calibri" w:cs="Calibri"/>
+          <w:b/>
+          <w:sz w:val="28"/>
+        </w:rPr>
+        <w:t xml:space="preserve"> module </w:t>
+      </w:r>
+      <w:proofErr w:type="spellStart"/>
+      <w:r>
+        <w:rPr>
+          <w:rFonts w:ascii="Calibri" w:eastAsia="Calibri" w:hAnsi="Calibri" w:cs="Calibri"/>
+          <w:b/>
+          <w:sz w:val="28"/>
+        </w:rPr>
+        <w:t>mein</w:t>
+      </w:r>
+      <w:proofErr w:type="spellEnd"/>
+      <w:r>
+        <w:rPr>
+          <w:rFonts w:ascii="Calibri" w:eastAsia="Calibri" w:hAnsi="Calibri" w:cs="Calibri"/>
+          <w:b/>
+          <w:sz w:val="28"/>
+        </w:rPr>
+        <w:t>:</w:t>
+      </w:r>
+    </w:p>
+    <w:p>
+      <w:pPr>
+        <w:numPr>
+          <w:ilvl w:val="0"/>
+          <w:numId w:val="3"/>
+        </w:numPr>
+        <w:ind w:left="1440" w:hanging="360"/>
+        <w:rPr>
+          <w:rFonts w:ascii="Calibri" w:eastAsia="Calibri" w:hAnsi="Calibri" w:cs="Calibri"/>
+          <w:b/>
+          <w:sz w:val="28"/>
+        </w:rPr>
+      </w:pPr>
+      <w:r>
+        <w:rPr>
+          <w:rFonts w:ascii="Calibri" w:eastAsia="Calibri" w:hAnsi="Calibri" w:cs="Calibri"/>
+          <w:b/>
+          <w:sz w:val="28"/>
+        </w:rPr>
+        <w:t xml:space="preserve">Migration (with </w:t>
+      </w:r>
+      <w:proofErr w:type="spellStart"/>
+      <w:r>
+        <w:rPr>
+          <w:rFonts w:ascii="Calibri" w:eastAsia="Calibri" w:hAnsi="Calibri" w:cs="Calibri"/>
+          <w:b/>
+          <w:sz w:val="28"/>
+        </w:rPr>
+        <w:t>softDeletes</w:t>
+      </w:r>
+      <w:proofErr w:type="spellEnd"/>
+      <w:r>
+        <w:rPr>
+          <w:rFonts w:ascii="Calibri" w:eastAsia="Calibri" w:hAnsi="Calibri" w:cs="Calibri"/>
+          <w:b/>
+          <w:sz w:val="28"/>
+        </w:rPr>
+        <w:t xml:space="preserve"> + timestamps + auto-code generation)</w:t>
+      </w:r>
+    </w:p>
+    <w:p>
+      <w:pPr>
+        <w:numPr>
+          <w:ilvl w:val="0"/>
+          <w:numId w:val="3"/>
+        </w:numPr>
+        <w:ind w:left="1440" w:hanging="360"/>
+        <w:rPr>
+          <w:rFonts w:ascii="Calibri" w:eastAsia="Calibri" w:hAnsi="Calibri" w:cs="Calibri"/>
+          <w:b/>
+          <w:sz w:val="28"/>
+        </w:rPr>
+      </w:pPr>
+      <w:r>
+        <w:rPr>
+          <w:rFonts w:ascii="Calibri" w:eastAsia="Calibri" w:hAnsi="Calibri" w:cs="Calibri"/>
+          <w:b/>
+          <w:sz w:val="28"/>
+        </w:rPr>
+        <w:t>Model (fillable, casts, boot, relationships, sco</w:t>
+      </w:r>
+      <w:r>
+        <w:rPr>
+          <w:rFonts w:ascii="Calibri" w:eastAsia="Calibri" w:hAnsi="Calibri" w:cs="Calibri"/>
+          <w:b/>
+          <w:sz w:val="28"/>
+        </w:rPr>
+        <w:t xml:space="preserve">pes, </w:t>
+      </w:r>
+      <w:proofErr w:type="spellStart"/>
+      <w:r>
+        <w:rPr>
+          <w:rFonts w:ascii="Calibri" w:eastAsia="Calibri" w:hAnsi="Calibri" w:cs="Calibri"/>
+          <w:b/>
+          <w:sz w:val="28"/>
+        </w:rPr>
+        <w:t>accessors</w:t>
+      </w:r>
+      <w:proofErr w:type="spellEnd"/>
+      <w:r>
+        <w:rPr>
+          <w:rFonts w:ascii="Calibri" w:eastAsia="Calibri" w:hAnsi="Calibri" w:cs="Calibri"/>
+          <w:b/>
+          <w:sz w:val="28"/>
+        </w:rPr>
+        <w:t>)</w:t>
+      </w:r>
+    </w:p>
+    <w:p>
+      <w:pPr>
+        <w:numPr>
+          <w:ilvl w:val="0"/>
+          <w:numId w:val="3"/>
+        </w:numPr>
+        <w:ind w:left="1440" w:hanging="360"/>
+        <w:rPr>
+          <w:rFonts w:ascii="Calibri" w:eastAsia="Calibri" w:hAnsi="Calibri" w:cs="Calibri"/>
+          <w:b/>
+          <w:sz w:val="28"/>
+        </w:rPr>
+      </w:pPr>
+      <w:r>
+        <w:rPr>
+          <w:rFonts w:ascii="Calibri" w:eastAsia="Calibri" w:hAnsi="Calibri" w:cs="Calibri"/>
+          <w:b/>
+          <w:sz w:val="28"/>
+        </w:rPr>
+        <w:t>Controller (index/create/store/show/edit/update/destroy)</w:t>
+      </w:r>
+    </w:p>
+    <w:p>
+      <w:pPr>
+        <w:numPr>
+          <w:ilvl w:val="0"/>
+          <w:numId w:val="3"/>
+        </w:numPr>
+        <w:ind w:left="1440" w:hanging="360"/>
+        <w:rPr>
+          <w:rFonts w:ascii="Calibri" w:eastAsia="Calibri" w:hAnsi="Calibri" w:cs="Calibri"/>
+          <w:b/>
+          <w:sz w:val="28"/>
+        </w:rPr>
+      </w:pPr>
+      <w:r>
+        <w:rPr>
+          <w:rFonts w:ascii="Calibri" w:eastAsia="Calibri" w:hAnsi="Calibri" w:cs="Calibri"/>
+          <w:b/>
+          <w:sz w:val="28"/>
+        </w:rPr>
         <w:lastRenderedPageBreak/>
-        <w:t>Har</w:t>
-      </w:r>
-      <w:proofErr w:type="spellEnd"/>
-      <w:r>
-        <w:rPr>
-          <w:rFonts w:ascii="Calibri" w:eastAsia="Calibri" w:hAnsi="Calibri" w:cs="Calibri"/>
-          <w:b/>
-          <w:sz w:val="28"/>
-        </w:rPr>
-        <w:t xml:space="preserve"> module </w:t>
-      </w:r>
-      <w:proofErr w:type="spellStart"/>
-      <w:r>
-        <w:rPr>
-          <w:rFonts w:ascii="Calibri" w:eastAsia="Calibri" w:hAnsi="Calibri" w:cs="Calibri"/>
-          <w:b/>
-          <w:sz w:val="28"/>
-        </w:rPr>
-        <w:t>mein</w:t>
-      </w:r>
-      <w:proofErr w:type="spellEnd"/>
-      <w:r>
-        <w:rPr>
-          <w:rFonts w:ascii="Calibri" w:eastAsia="Calibri" w:hAnsi="Calibri" w:cs="Calibri"/>
-          <w:b/>
-          <w:sz w:val="28"/>
-        </w:rPr>
-        <w:t>:</w:t>
-      </w:r>
-    </w:p>
-    <w:p>
-      <w:pPr>
-        <w:numPr>
-          <w:ilvl w:val="0"/>
-          <w:numId w:val="3"/>
-        </w:numPr>
-        <w:ind w:left="1440" w:hanging="360"/>
-        <w:rPr>
-          <w:rFonts w:ascii="Calibri" w:eastAsia="Calibri" w:hAnsi="Calibri" w:cs="Calibri"/>
-          <w:b/>
-          <w:sz w:val="28"/>
-        </w:rPr>
-      </w:pPr>
-      <w:r>
-        <w:rPr>
-          <w:rFonts w:ascii="Calibri" w:eastAsia="Calibri" w:hAnsi="Calibri" w:cs="Calibri"/>
-          <w:b/>
-          <w:sz w:val="28"/>
-        </w:rPr>
-        <w:t xml:space="preserve">Migration (with </w:t>
-      </w:r>
-      <w:proofErr w:type="spellStart"/>
-      <w:r>
-        <w:rPr>
-          <w:rFonts w:ascii="Calibri" w:eastAsia="Calibri" w:hAnsi="Calibri" w:cs="Calibri"/>
-          <w:b/>
-          <w:sz w:val="28"/>
-        </w:rPr>
-        <w:t>softDeletes</w:t>
-      </w:r>
-      <w:proofErr w:type="spellEnd"/>
-      <w:r>
-        <w:rPr>
-          <w:rFonts w:ascii="Calibri" w:eastAsia="Calibri" w:hAnsi="Calibri" w:cs="Calibri"/>
-          <w:b/>
-          <w:sz w:val="28"/>
-        </w:rPr>
-        <w:t xml:space="preserve"> + timestamps + auto-code generation)</w:t>
-      </w:r>
-    </w:p>
-    <w:p>
-      <w:pPr>
-        <w:numPr>
-          <w:ilvl w:val="0"/>
-          <w:numId w:val="3"/>
-        </w:numPr>
-        <w:ind w:left="1440" w:hanging="360"/>
-        <w:rPr>
-          <w:rFonts w:ascii="Calibri" w:eastAsia="Calibri" w:hAnsi="Calibri" w:cs="Calibri"/>
-          <w:b/>
-          <w:sz w:val="28"/>
-        </w:rPr>
-      </w:pPr>
-      <w:r>
-        <w:rPr>
-          <w:rFonts w:ascii="Calibri" w:eastAsia="Calibri" w:hAnsi="Calibri" w:cs="Calibri"/>
-          <w:b/>
-          <w:sz w:val="28"/>
-        </w:rPr>
-        <w:t>Model (fillable, casts, boot, relationships, sco</w:t>
-      </w:r>
-      <w:r>
-        <w:rPr>
-          <w:rFonts w:ascii="Calibri" w:eastAsia="Calibri" w:hAnsi="Calibri" w:cs="Calibri"/>
-          <w:b/>
-          <w:sz w:val="28"/>
-        </w:rPr>
-        <w:t xml:space="preserve">pes, </w:t>
-      </w:r>
-      <w:proofErr w:type="spellStart"/>
-      <w:r>
-        <w:rPr>
-          <w:rFonts w:ascii="Calibri" w:eastAsia="Calibri" w:hAnsi="Calibri" w:cs="Calibri"/>
-          <w:b/>
-          <w:sz w:val="28"/>
-        </w:rPr>
-        <w:t>accessors</w:t>
-      </w:r>
-      <w:proofErr w:type="spellEnd"/>
-      <w:r>
-        <w:rPr>
-          <w:rFonts w:ascii="Calibri" w:eastAsia="Calibri" w:hAnsi="Calibri" w:cs="Calibri"/>
-          <w:b/>
-          <w:sz w:val="28"/>
-        </w:rPr>
-        <w:t>)</w:t>
-      </w:r>
-    </w:p>
-    <w:p>
-      <w:pPr>
-        <w:numPr>
-          <w:ilvl w:val="0"/>
-          <w:numId w:val="3"/>
-        </w:numPr>
-        <w:ind w:left="1440" w:hanging="360"/>
-        <w:rPr>
-          <w:rFonts w:ascii="Calibri" w:eastAsia="Calibri" w:hAnsi="Calibri" w:cs="Calibri"/>
-          <w:b/>
-          <w:sz w:val="28"/>
-        </w:rPr>
-      </w:pPr>
-      <w:r>
-        <w:rPr>
-          <w:rFonts w:ascii="Calibri" w:eastAsia="Calibri" w:hAnsi="Calibri" w:cs="Calibri"/>
-          <w:b/>
-          <w:sz w:val="28"/>
-        </w:rPr>
-        <w:t>Controller (index/create/store/show/edit/update/destroy)</w:t>
-      </w:r>
-    </w:p>
-    <w:p>
-      <w:pPr>
-        <w:numPr>
-          <w:ilvl w:val="0"/>
-          <w:numId w:val="3"/>
-        </w:numPr>
-        <w:ind w:left="1440" w:hanging="360"/>
-        <w:rPr>
-          <w:rFonts w:ascii="Calibri" w:eastAsia="Calibri" w:hAnsi="Calibri" w:cs="Calibri"/>
-          <w:b/>
-          <w:sz w:val="28"/>
-        </w:rPr>
-      </w:pPr>
-      <w:r>
-        <w:rPr>
-          <w:rFonts w:ascii="Calibri" w:eastAsia="Calibri" w:hAnsi="Calibri" w:cs="Calibri"/>
-          <w:b/>
-          <w:sz w:val="28"/>
-        </w:rPr>
         <w:t xml:space="preserve">Blade views (index, create, show, edit) extending </w:t>
       </w:r>
       <w:proofErr w:type="spellStart"/>

</xml_diff>

<commit_message>
nurse dashboard fully completed
</commit_message>
<xml_diff>
--- a/Requirements .docx
+++ b/Requirements .docx
@@ -7109,6 +7109,41 @@
           <w:rFonts w:eastAsia="Calibri"/>
         </w:rPr>
       </w:pPr>
+      <w:r>
+        <w:rPr>
+          <w:rFonts w:eastAsia="Calibri"/>
+        </w:rPr>
+        <w:t>Nurse : username :</w:t>
+      </w:r>
+      <w:proofErr w:type="spellStart"/>
+      <w:r>
+        <w:rPr>
+          <w:rFonts w:eastAsia="Calibri"/>
+        </w:rPr>
+        <w:t>asma</w:t>
+      </w:r>
+      <w:proofErr w:type="spellEnd"/>
+      <w:r>
+        <w:rPr>
+          <w:rFonts w:eastAsia="Calibri"/>
+        </w:rPr>
+        <w:tab/>
+        <w:t>password :asma</w:t>
+      </w:r>
+      <w:r>
+        <w:rPr>
+          <w:rFonts w:eastAsia="Calibri"/>
+        </w:rPr>
+        <w:t>khan</w:t>
+      </w:r>
+      <w:bookmarkStart w:id="0" w:name="_GoBack"/>
+      <w:bookmarkEnd w:id="0"/>
+      <w:r>
+        <w:rPr>
+          <w:rFonts w:eastAsia="Calibri"/>
+        </w:rPr>
+        <w:t>123</w:t>
+      </w:r>
     </w:p>
     <w:p>
       <w:pPr>
@@ -7174,8 +7209,6 @@
           <w:rFonts w:eastAsia="Calibri"/>
         </w:rPr>
       </w:pPr>
-      <w:bookmarkStart w:id="0" w:name="_GoBack"/>
-      <w:bookmarkEnd w:id="0"/>
     </w:p>
     <w:p>
       <w:pPr>

</xml_diff>